<commit_message>
iterate literature review: metadata, method, DOIs, 5-col table
</commit_message>
<xml_diff>
--- a/LITERATURE_REVIEW_DOCUMENT.docx
+++ b/LITERATURE_REVIEW_DOCUMENT.docx
@@ -41,8 +41,36 @@
       </w:r>
     </w:p>
     <w:p>
+      <w:pPr>
+        <w:jc w:val="center"/>
+      </w:pPr>
       <w:r>
-        <w:t>This document reviews the base paper and supporting works used in the SynCura project. For each study it records (1) key findings, (2) limitations for real-time clinical use, and (3) the specific idea adopted by SynCura. The comparative summary is in Table 1; detailed notes follow.</w:t>
+        <w:rPr>
+          <w:i/>
+          <w:sz w:val="18"/>
+        </w:rPr>
+        <w:t>Team: Abdul Ahad Ikkeri (4PA24CS002), Fathima Reeha (4PA24CS026), Fizan Feroz (4PA24CS032) | Date: 2026-09-18 | Version: 1.1</w:t>
+      </w:r>
+    </w:p>
+    <w:p>
+      <w:r>
+        <w:t>This document reviews the base paper and supporting works used in SynCura. For each study it records (1) key findings, (2) limitations for real-time clinical use, and (3) the specific idea adopted by SynCura. Table 1 is the comparative summary; detailed notes follow.</w:t>
+      </w:r>
+    </w:p>
+    <w:p>
+      <w:pPr>
+        <w:pStyle w:val="IntenseQuote"/>
+      </w:pPr>
+      <w:r>
+        <w:t>Selection method. Papers cover (a) the closest architecture-task match, (b) realistic LSTM targets, (c) vitals-only and multimodal contrasts, (d) missing-data and external-validation practice, and (e) interpretable early-warning and streaming deployment. Sources match Slide 15 of ppt/SynCura_Deck_V3_FINAL.pptx.</w:t>
+      </w:r>
+    </w:p>
+    <w:p>
+      <w:pPr>
+        <w:pStyle w:val="IntenseQuote"/>
+      </w:pPr>
+      <w:r>
+        <w:t>How to read the numbers. AUROC/AUC values come from different cohorts, labels, windows, and splits; they are reference points, not head-to-head comparisons. SynCura: validation AUC 0.840, fresh unseen 20% set-B holdout AUC 0.844 (95% CI 0.836–0.852), per ppt/figs/metrics.json.</w:t>
       </w:r>
     </w:p>
     <w:p>
@@ -70,15 +98,36 @@
         <w:tblLook w:firstColumn="1" w:firstRow="1" w:lastColumn="0" w:lastRow="0" w:noHBand="0" w:noVBand="1" w:val="04A0"/>
       </w:tblPr>
       <w:tblGrid>
-        <w:gridCol w:w="2412"/>
-        <w:gridCol w:w="2412"/>
-        <w:gridCol w:w="2412"/>
-        <w:gridCol w:w="2412"/>
+        <w:gridCol w:w="2045"/>
+        <w:gridCol w:w="2045"/>
+        <w:gridCol w:w="2045"/>
+        <w:gridCol w:w="2045"/>
+        <w:gridCol w:w="2045"/>
       </w:tblGrid>
       <w:tr>
+        <w:trPr>
+          <w:tblHeader/>
+        </w:trPr>
         <w:tc>
           <w:tcPr>
-            <w:tcW w:type="dxa" w:w="2412"/>
+            <w:tcW w:type="dxa" w:w="648"/>
+            <w:shd w:val="clear" w:fill="1F4E79"/>
+          </w:tcPr>
+          <w:p>
+            <w:r/>
+            <w:r>
+              <w:rPr>
+                <w:b/>
+                <w:color w:val="FFFFFF"/>
+                <w:sz w:val="18"/>
+              </w:rPr>
+              <w:t>No.</w:t>
+            </w:r>
+          </w:p>
+        </w:tc>
+        <w:tc>
+          <w:tcPr>
+            <w:tcW w:type="dxa" w:w="2520"/>
             <w:shd w:val="clear" w:fill="1F4E79"/>
           </w:tcPr>
           <w:p>
@@ -95,7 +144,7 @@
         </w:tc>
         <w:tc>
           <w:tcPr>
-            <w:tcW w:type="dxa" w:w="2412"/>
+            <w:tcW w:type="dxa" w:w="3096"/>
             <w:shd w:val="clear" w:fill="1F4E79"/>
           </w:tcPr>
           <w:p>
@@ -112,7 +161,7 @@
         </w:tc>
         <w:tc>
           <w:tcPr>
-            <w:tcW w:type="dxa" w:w="2412"/>
+            <w:tcW w:type="dxa" w:w="3096"/>
             <w:shd w:val="clear" w:fill="1F4E79"/>
           </w:tcPr>
           <w:p>
@@ -129,7 +178,7 @@
         </w:tc>
         <w:tc>
           <w:tcPr>
-            <w:tcW w:type="dxa" w:w="2412"/>
+            <w:tcW w:type="dxa" w:w="3096"/>
             <w:shd w:val="clear" w:fill="1F4E79"/>
           </w:tcPr>
           <w:p>
@@ -148,7 +197,7 @@
       <w:tr>
         <w:tc>
           <w:tcPr>
-            <w:tcW w:type="dxa" w:w="2412"/>
+            <w:tcW w:type="dxa" w:w="648"/>
           </w:tcPr>
           <w:p>
             <w:r/>
@@ -156,13 +205,13 @@
               <w:rPr>
                 <w:sz w:val="16"/>
               </w:rPr>
-              <w:t>[1] Base — Zheng et al. (2025), JMIR 27:e69293. TBAL on 176,344 ICU stays (MIMIC-IV + eICU).</w:t>
+              <w:t>[1]</w:t>
             </w:r>
           </w:p>
         </w:tc>
         <w:tc>
           <w:tcPr>
-            <w:tcW w:type="dxa" w:w="2412"/>
+            <w:tcW w:type="dxa" w:w="2520"/>
           </w:tcPr>
           <w:p>
             <w:r/>
@@ -170,13 +219,13 @@
               <w:rPr>
                 <w:sz w:val="16"/>
               </w:rPr>
-              <w:t>Dynamic AUROC 0.936 (MIMIC-IV), 0.919 external eICU, recall 79.1%; hourly risk; time-aware attention highlights relevant time points.</w:t>
+              <w:t>Zheng et al. (2025), JMIR 27:e69293. TBAL, 176,344 stays (MIMIC-IV + eICU).</w:t>
             </w:r>
           </w:p>
         </w:tc>
         <w:tc>
           <w:tcPr>
-            <w:tcW w:type="dxa" w:w="2412"/>
+            <w:tcW w:type="dxa" w:w="3096"/>
           </w:tcPr>
           <w:p>
             <w:r/>
@@ -184,13 +233,13 @@
               <w:rPr>
                 <w:sz w:val="16"/>
               </w:rPr>
-              <w:t>Retrospective data till discharge (AUROC 0.989 at discharge = hindsight bias); cross-hospital fall to ~0.81/0.76; no bedside trial; richer EMR inputs than a streaming service can assume.</w:t>
+              <w:t>Dynamic AUROC 0.936 (MIMIC-IV), 0.919 external eICU, recall 79.1%; hourly risk; time-aware attention.</w:t>
             </w:r>
           </w:p>
         </w:tc>
         <w:tc>
           <w:tcPr>
-            <w:tcW w:type="dxa" w:w="2412"/>
+            <w:tcW w:type="dxa" w:w="3096"/>
           </w:tcPr>
           <w:p>
             <w:r/>
@@ -198,7 +247,21 @@
               <w:rPr>
                 <w:sz w:val="16"/>
               </w:rPr>
-              <w:t>Main template: 2-layer LSTM-96 + temporal attention; rolling 90-min past-only windows; attention for temporal explanation; SHAP added for feature explanation.</w:t>
+              <w:t>Retrospective till discharge (0.989 at discharge = hindsight bias); cross-hospital ~0.81/0.76; no bedside trial; richer EMR than streaming allows.</w:t>
+            </w:r>
+          </w:p>
+        </w:tc>
+        <w:tc>
+          <w:tcPr>
+            <w:tcW w:type="dxa" w:w="3096"/>
+          </w:tcPr>
+          <w:p>
+            <w:r/>
+            <w:r>
+              <w:rPr>
+                <w:sz w:val="16"/>
+              </w:rPr>
+              <w:t>Main template: 2-layer LSTM-96 + temporal attention; 90-min past-only windows; attention for temporal explanation; SHAP added.</w:t>
             </w:r>
           </w:p>
         </w:tc>
@@ -206,7 +269,7 @@
       <w:tr>
         <w:tc>
           <w:tcPr>
-            <w:tcW w:type="dxa" w:w="2412"/>
+            <w:tcW w:type="dxa" w:w="648"/>
           </w:tcPr>
           <w:p>
             <w:r/>
@@ -214,13 +277,13 @@
               <w:rPr>
                 <w:sz w:val="16"/>
               </w:rPr>
-              <w:t>[2] Wang, Bai &amp; Jin (2026), Front. Physiol. 17. Explainable ICU models.</w:t>
+              <w:t>[2]</w:t>
             </w:r>
           </w:p>
         </w:tc>
         <w:tc>
           <w:tcPr>
-            <w:tcW w:type="dxa" w:w="2412"/>
+            <w:tcW w:type="dxa" w:w="2520"/>
           </w:tcPr>
           <w:p>
             <w:r/>
@@ -228,13 +291,13 @@
               <w:rPr>
                 <w:sz w:val="16"/>
               </w:rPr>
-              <w:t>Explainable LSTM models, AUC ~0.79–0.87; feature explanations support clinical interpretation.</w:t>
+              <w:t>Wang, Bai &amp; Jin (2026), Front. Physiol. 17. Explainable ICU models.</w:t>
             </w:r>
           </w:p>
         </w:tc>
         <w:tc>
           <w:tcPr>
-            <w:tcW w:type="dxa" w:w="2412"/>
+            <w:tcW w:type="dxa" w:w="3096"/>
           </w:tcPr>
           <w:p>
             <w:r/>
@@ -242,13 +305,13 @@
               <w:rPr>
                 <w:sz w:val="16"/>
               </w:rPr>
-              <w:t>Single-dataset; explanations are descriptive not causal; thin reporting of false alarms, lead time, calibration.</w:t>
+              <w:t>Explainable LSTM, AUC ~0.79–0.87; feature explanations aid review.</w:t>
             </w:r>
           </w:p>
         </w:tc>
         <w:tc>
           <w:tcPr>
-            <w:tcW w:type="dxa" w:w="2412"/>
+            <w:tcW w:type="dxa" w:w="3096"/>
           </w:tcPr>
           <w:p>
             <w:r/>
@@ -256,7 +319,21 @@
               <w:rPr>
                 <w:sz w:val="16"/>
               </w:rPr>
-              <w:t>Explainability justification: temporal attention (when) + SHAP (which features), served via dashboard and /patient/{id}/explain.</w:t>
+              <w:t>Single-dataset; descriptive not causal; thin false-alarm/lead-time/calibration reporting.</w:t>
+            </w:r>
+          </w:p>
+        </w:tc>
+        <w:tc>
+          <w:tcPr>
+            <w:tcW w:type="dxa" w:w="3096"/>
+          </w:tcPr>
+          <w:p>
+            <w:r/>
+            <w:r>
+              <w:rPr>
+                <w:sz w:val="16"/>
+              </w:rPr>
+              <w:t>Attention (when) + SHAP (which features) via dashboard and /patient/{id}/explain.</w:t>
             </w:r>
           </w:p>
         </w:tc>
@@ -264,7 +341,7 @@
       <w:tr>
         <w:tc>
           <w:tcPr>
-            <w:tcW w:type="dxa" w:w="2412"/>
+            <w:tcW w:type="dxa" w:w="648"/>
           </w:tcPr>
           <w:p>
             <w:r/>
@@ -272,13 +349,13 @@
               <w:rPr>
                 <w:sz w:val="16"/>
               </w:rPr>
-              <w:t>[3] Yan et al. (2026), PeerJ 14:e21631. LSTM/GRU/RNN/Transformer/Informer + stacking.</w:t>
+              <w:t>[3]</w:t>
             </w:r>
           </w:p>
         </w:tc>
         <w:tc>
           <w:tcPr>
-            <w:tcW w:type="dxa" w:w="2412"/>
+            <w:tcW w:type="dxa" w:w="2520"/>
           </w:tcPr>
           <w:p>
             <w:r/>
@@ -286,13 +363,13 @@
               <w:rPr>
                 <w:sz w:val="16"/>
               </w:rPr>
-              <w:t>Plain LSTM best single model, AUC 0.802 (95% CI 0.774–0.828); external scores below internal scores.</w:t>
+              <w:t>Yan et al. (2026), PeerJ 14:e21631. LSTM/GRU/RNN/Transformer/Informer.</w:t>
             </w:r>
           </w:p>
         </w:tc>
         <w:tc>
           <w:tcPr>
-            <w:tcW w:type="dxa" w:w="2412"/>
+            <w:tcW w:type="dxa" w:w="3096"/>
           </w:tcPr>
           <w:p>
             <w:r/>
@@ -300,13 +377,13 @@
               <w:rPr>
                 <w:sz w:val="16"/>
               </w:rPr>
-              <w:t>Modest AUC; stacking adds complexity/latency; retrospective, no deployment or alert-fatigue analysis.</w:t>
+              <w:t>Plain LSTM best single, AUC 0.802 (95% CI 0.774–0.828); external below internal.</w:t>
             </w:r>
           </w:p>
         </w:tc>
         <w:tc>
           <w:tcPr>
-            <w:tcW w:type="dxa" w:w="2412"/>
+            <w:tcW w:type="dxa" w:w="3096"/>
           </w:tcPr>
           <w:p>
             <w:r/>
@@ -314,7 +391,21 @@
               <w:rPr>
                 <w:sz w:val="16"/>
               </w:rPr>
-              <w:t>Realistic benchmark: kept LSTM baseline; adopted unseen-patient evaluation (fresh 20% set-B holdout).</w:t>
+              <w:t>Modest AUC; stacking adds complexity; retrospective, no deployment analysis.</w:t>
+            </w:r>
+          </w:p>
+        </w:tc>
+        <w:tc>
+          <w:tcPr>
+            <w:tcW w:type="dxa" w:w="3096"/>
+          </w:tcPr>
+          <w:p>
+            <w:r/>
+            <w:r>
+              <w:rPr>
+                <w:sz w:val="16"/>
+              </w:rPr>
+              <w:t>Kept LSTM baseline; unseen-patient evaluation (fresh 20% set-B holdout).</w:t>
             </w:r>
           </w:p>
         </w:tc>
@@ -322,7 +413,7 @@
       <w:tr>
         <w:tc>
           <w:tcPr>
-            <w:tcW w:type="dxa" w:w="2412"/>
+            <w:tcW w:type="dxa" w:w="648"/>
           </w:tcPr>
           <w:p>
             <w:r/>
@@ -330,13 +421,13 @@
               <w:rPr>
                 <w:sz w:val="16"/>
               </w:rPr>
-              <w:t>[4] Sadanandan (2026), arXiv:2603.14719. LSTM + ClinicalBERT, 74,822 stays.</w:t>
+              <w:t>[4]</w:t>
             </w:r>
           </w:p>
         </w:tc>
         <w:tc>
           <w:tcPr>
-            <w:tcW w:type="dxa" w:w="2412"/>
+            <w:tcW w:type="dxa" w:w="2520"/>
           </w:tcPr>
           <w:p>
             <w:r/>
@@ -344,13 +435,13 @@
               <w:rPr>
                 <w:sz w:val="16"/>
               </w:rPr>
-              <w:t>AUROC 0.7857, AUPRC 0.1908; survey: structured-only models typically AUC 0.70–0.85.</w:t>
+              <w:t>Sadanandan (2026), arXiv:2603.14719. LSTM + ClinicalBERT, 74,822 stays.</w:t>
             </w:r>
           </w:p>
         </w:tc>
         <w:tc>
           <w:tcPr>
-            <w:tcW w:type="dxa" w:w="2412"/>
+            <w:tcW w:type="dxa" w:w="3096"/>
           </w:tcPr>
           <w:p>
             <w:r/>
@@ -358,13 +449,13 @@
               <w:rPr>
                 <w:sz w:val="16"/>
               </w:rPr>
-              <w:t>Multimodal cost (data, privacy, compute, latency); low AUPRC; no bedside deployment.</w:t>
+              <w:t>AUROC 0.7857, AUPRC 0.1908; structured-only field range 0.70–0.85.</w:t>
             </w:r>
           </w:p>
         </w:tc>
         <w:tc>
           <w:tcPr>
-            <w:tcW w:type="dxa" w:w="2412"/>
+            <w:tcW w:type="dxa" w:w="3096"/>
           </w:tcPr>
           <w:p>
             <w:r/>
@@ -372,7 +463,21 @@
               <w:rPr>
                 <w:sz w:val="16"/>
               </w:rPr>
-              <w:t>Scope control: used 0.70–0.85 as realistic target; deferred note fusion to future work.</w:t>
+              <w:t>Multimodal cost/privacy/compute/latency; low AUPRC; no bedside deploy.</w:t>
+            </w:r>
+          </w:p>
+        </w:tc>
+        <w:tc>
+          <w:tcPr>
+            <w:tcW w:type="dxa" w:w="3096"/>
+          </w:tcPr>
+          <w:p>
+            <w:r/>
+            <w:r>
+              <w:rPr>
+                <w:sz w:val="16"/>
+              </w:rPr>
+              <w:t>Used range to avoid overclaiming; deferred notes fusion to future work.</w:t>
             </w:r>
           </w:p>
         </w:tc>
@@ -380,7 +485,7 @@
       <w:tr>
         <w:tc>
           <w:tcPr>
-            <w:tcW w:type="dxa" w:w="2412"/>
+            <w:tcW w:type="dxa" w:w="648"/>
           </w:tcPr>
           <w:p>
             <w:r/>
@@ -388,13 +493,13 @@
               <w:rPr>
                 <w:sz w:val="16"/>
               </w:rPr>
-              <w:t>[5] Wu et al. (2024), J. Big Data 11:40. Vital-sign LSTM, 33,798 + 889 external.</w:t>
+              <w:t>[5]</w:t>
             </w:r>
           </w:p>
         </w:tc>
         <w:tc>
           <w:tcPr>
-            <w:tcW w:type="dxa" w:w="2412"/>
+            <w:tcW w:type="dxa" w:w="2520"/>
           </w:tcPr>
           <w:p>
             <w:r/>
@@ -402,13 +507,13 @@
               <w:rPr>
                 <w:sz w:val="16"/>
               </w:rPr>
-              <w:t>Vital-sign LSTM AUC 0.9263, well above RF (~0.744); small vital set carries strong signal.</w:t>
+              <w:t>Wu et al. (2024), J. Big Data 11:40. Vital-sign LSTM + external 889.</w:t>
             </w:r>
           </w:p>
         </w:tc>
         <w:tc>
           <w:tcPr>
-            <w:tcW w:type="dxa" w:w="2412"/>
+            <w:tcW w:type="dxa" w:w="3096"/>
           </w:tcPr>
           <w:p>
             <w:r/>
@@ -416,13 +521,13 @@
               <w:rPr>
                 <w:sz w:val="16"/>
               </w:rPr>
-              <w:t>Different cohort/pipeline — reference ceiling, not head-to-head; limited explainability/deployment.</w:t>
+              <w:t>Vitals LSTM AUC 0.9263, above RF (~0.744); small vitals carry strong signal.</w:t>
             </w:r>
           </w:p>
         </w:tc>
         <w:tc>
           <w:tcPr>
-            <w:tcW w:type="dxa" w:w="2412"/>
+            <w:tcW w:type="dxa" w:w="3096"/>
           </w:tcPr>
           <w:p>
             <w:r/>
@@ -430,7 +535,21 @@
               <w:rPr>
                 <w:sz w:val="16"/>
               </w:rPr>
-              <w:t>Upper-bound reference: same core vitals kept, extended to 12 vitals+labs with attention, SHAP, serving path.</w:t>
+              <w:t>Different cohort/pipeline — ceiling, not head-to-head; limited explainability.</w:t>
+            </w:r>
+          </w:p>
+        </w:tc>
+        <w:tc>
+          <w:tcPr>
+            <w:tcW w:type="dxa" w:w="3096"/>
+          </w:tcPr>
+          <w:p>
+            <w:r/>
+            <w:r>
+              <w:rPr>
+                <w:sz w:val="16"/>
+              </w:rPr>
+              <w:t>Same core vitals kept, extended to 12 vitals+labs with attention, SHAP, serving.</w:t>
             </w:r>
           </w:p>
         </w:tc>
@@ -438,7 +557,7 @@
       <w:tr>
         <w:tc>
           <w:tcPr>
-            <w:tcW w:type="dxa" w:w="2412"/>
+            <w:tcW w:type="dxa" w:w="648"/>
           </w:tcPr>
           <w:p>
             <w:r/>
@@ -446,13 +565,13 @@
               <w:rPr>
                 <w:sz w:val="16"/>
               </w:rPr>
-              <w:t>[6] Xie et al. (2025), npj Digit. Med. 8:733. RealMIP generative recovery.</w:t>
+              <w:t>[6]</w:t>
             </w:r>
           </w:p>
         </w:tc>
         <w:tc>
           <w:tcPr>
-            <w:tcW w:type="dxa" w:w="2412"/>
+            <w:tcW w:type="dxa" w:w="2520"/>
           </w:tcPr>
           <w:p>
             <w:r/>
@@ -460,13 +579,13 @@
               <w:rPr>
                 <w:sz w:val="16"/>
               </w:rPr>
-              <w:t>AUC ~0.957–0.968 across eICU/MIMIC-IV/SICdb; real-time missing-data recovery improves robustness.</w:t>
+              <w:t>Xie et al. (2025), npj Digit. Med. 8:733. RealMIP recovery.</w:t>
             </w:r>
           </w:p>
         </w:tc>
         <w:tc>
           <w:tcPr>
-            <w:tcW w:type="dxa" w:w="2412"/>
+            <w:tcW w:type="dxa" w:w="3096"/>
           </w:tcPr>
           <w:p>
             <w:r/>
@@ -474,13 +593,13 @@
               <w:rPr>
                 <w:sz w:val="16"/>
               </w:rPr>
-              <w:t>Needs multi-database training; heavier model than a student prototype can deploy now.</w:t>
+              <w:t>AUC ~0.957–0.968 across eICU/MIMIC-IV/SICdb; real-time imputation helps.</w:t>
             </w:r>
           </w:p>
         </w:tc>
         <w:tc>
           <w:tcPr>
-            <w:tcW w:type="dxa" w:w="2412"/>
+            <w:tcW w:type="dxa" w:w="3096"/>
           </w:tcPr>
           <w:p>
             <w:r/>
@@ -488,7 +607,21 @@
               <w:rPr>
                 <w:sz w:val="16"/>
               </w:rPr>
-              <w:t>Roadmap: beyond interpolation + train-only z-score toward RealMIP-style recovery + external validation.</w:t>
+              <w:t>Needs multi-DB training; heavier than current prototype.</w:t>
+            </w:r>
+          </w:p>
+        </w:tc>
+        <w:tc>
+          <w:tcPr>
+            <w:tcW w:type="dxa" w:w="3096"/>
+          </w:tcPr>
+          <w:p>
+            <w:r/>
+            <w:r>
+              <w:rPr>
+                <w:sz w:val="16"/>
+              </w:rPr>
+              <w:t>Roadmap beyond interpolation + train-only z-score; add external validation.</w:t>
             </w:r>
           </w:p>
         </w:tc>
@@ -496,7 +629,7 @@
       <w:tr>
         <w:tc>
           <w:tcPr>
-            <w:tcW w:type="dxa" w:w="2412"/>
+            <w:tcW w:type="dxa" w:w="648"/>
           </w:tcPr>
           <w:p>
             <w:r/>
@@ -504,13 +637,13 @@
               <w:rPr>
                 <w:sz w:val="16"/>
               </w:rPr>
-              <w:t>[7] Choi et al. (2020), IEEE J-BHI 24(9). Interpretable BiLSTM early warning.</w:t>
+              <w:t>[7]</w:t>
             </w:r>
           </w:p>
         </w:tc>
         <w:tc>
           <w:tcPr>
-            <w:tcW w:type="dxa" w:w="2412"/>
+            <w:tcW w:type="dxa" w:w="2520"/>
           </w:tcPr>
           <w:p>
             <w:r/>
@@ -518,13 +651,13 @@
               <w:rPr>
                 <w:sz w:val="16"/>
               </w:rPr>
-              <w:t>AUROC ~0.880, beating NEWS2-style baseline; sequential warning over static thresholds.</w:t>
+              <w:t>Choi et al. (2020), IEEE J-BHI 24(9). Interpretable BiLSTM warning.</w:t>
             </w:r>
           </w:p>
         </w:tc>
         <w:tc>
           <w:tcPr>
-            <w:tcW w:type="dxa" w:w="2412"/>
+            <w:tcW w:type="dxa" w:w="3096"/>
           </w:tcPr>
           <w:p>
             <w:r/>
@@ -532,13 +665,13 @@
               <w:rPr>
                 <w:sz w:val="16"/>
               </w:rPr>
-              <w:t>Retrospective; attention is associative; thin calibration/false-alarm/workflow analysis.</w:t>
+              <w:t>AUROC ~0.880, beating NEWS2-style baseline; sequential over static.</w:t>
             </w:r>
           </w:p>
         </w:tc>
         <w:tc>
           <w:tcPr>
-            <w:tcW w:type="dxa" w:w="2412"/>
+            <w:tcW w:type="dxa" w:w="3096"/>
           </w:tcPr>
           <w:p>
             <w:r/>
@@ -546,7 +679,21 @@
               <w:rPr>
                 <w:sz w:val="16"/>
               </w:rPr>
-              <w:t>Adopted early-warning framing + NEWS2 benchmark with sensitivity, specificity, precision, false alarms, lead time.</w:t>
+              <w:t>Retrospective; associative attention; thin calibration/false-alarm analysis.</w:t>
+            </w:r>
+          </w:p>
+        </w:tc>
+        <w:tc>
+          <w:tcPr>
+            <w:tcW w:type="dxa" w:w="3096"/>
+          </w:tcPr>
+          <w:p>
+            <w:r/>
+            <w:r>
+              <w:rPr>
+                <w:sz w:val="16"/>
+              </w:rPr>
+              <w:t>NEWS2 benchmark with sensitivity, specificity, precision, false alarms, lead time.</w:t>
             </w:r>
           </w:p>
         </w:tc>
@@ -554,7 +701,7 @@
       <w:tr>
         <w:tc>
           <w:tcPr>
-            <w:tcW w:type="dxa" w:w="2412"/>
+            <w:tcW w:type="dxa" w:w="648"/>
           </w:tcPr>
           <w:p>
             <w:r/>
@@ -562,13 +709,13 @@
               <w:rPr>
                 <w:sz w:val="16"/>
               </w:rPr>
-              <w:t>[8] Scheid et al. (2025), Nat. Commun. 16:9513. Wearable continuous prediction.</w:t>
+              <w:t>[8]</w:t>
             </w:r>
           </w:p>
         </w:tc>
         <w:tc>
           <w:tcPr>
-            <w:tcW w:type="dxa" w:w="2412"/>
+            <w:tcW w:type="dxa" w:w="2520"/>
           </w:tcPr>
           <w:p>
             <w:r/>
@@ -576,13 +723,13 @@
               <w:rPr>
                 <w:sz w:val="16"/>
               </w:rPr>
-              <w:t>Continuous wearables reach AUROC ~0.89 with long lead time in-setting.</w:t>
+              <w:t>Scheid et al. (2025), Nat. Commun. 16:9513. Wearable continuous.</w:t>
             </w:r>
           </w:p>
         </w:tc>
         <w:tc>
           <w:tcPr>
-            <w:tcW w:type="dxa" w:w="2412"/>
+            <w:tcW w:type="dxa" w:w="3096"/>
           </w:tcPr>
           <w:p>
             <w:r/>
@@ -590,13 +737,13 @@
               <w:rPr>
                 <w:sz w:val="16"/>
               </w:rPr>
-              <w:t>Sensor noise, dropouts, irregular sampling, integration issues; not bedside-ready.</w:t>
+              <w:t>Wearables ~0.89 AUROC with long lead time in-setting.</w:t>
             </w:r>
           </w:p>
         </w:tc>
         <w:tc>
           <w:tcPr>
-            <w:tcW w:type="dxa" w:w="2412"/>
+            <w:tcW w:type="dxa" w:w="3096"/>
           </w:tcPr>
           <w:p>
             <w:r/>
@@ -604,7 +751,21 @@
               <w:rPr>
                 <w:sz w:val="16"/>
               </w:rPr>
-              <w:t>System path SENSE→INGEST→SCORE→ACT (ESP32+MAX30105, FastAPI/SQLite, 0–100 score, dashboard/alerts, HTTP+MQTT); kept prototype-only disclaimer.</w:t>
+              <w:t>Noise, dropouts, irregular sampling, integration gaps.</w:t>
+            </w:r>
+          </w:p>
+        </w:tc>
+        <w:tc>
+          <w:tcPr>
+            <w:tcW w:type="dxa" w:w="3096"/>
+          </w:tcPr>
+          <w:p>
+            <w:r/>
+            <w:r>
+              <w:rPr>
+                <w:sz w:val="16"/>
+              </w:rPr>
+              <w:t>SENSE→INGEST→SCORE→ACT (ESP32+MAX30105, FastAPI/SQLite, 0–100, dashboard/alerts, HTTP+MQTT); prototype-only disclaimer.</w:t>
             </w:r>
           </w:p>
         </w:tc>
@@ -612,7 +773,7 @@
       <w:tr>
         <w:tc>
           <w:tcPr>
-            <w:tcW w:type="dxa" w:w="2412"/>
+            <w:tcW w:type="dxa" w:w="648"/>
           </w:tcPr>
           <w:p>
             <w:r/>
@@ -620,13 +781,13 @@
               <w:rPr>
                 <w:sz w:val="16"/>
               </w:rPr>
-              <w:t>[9] PhysioNet Challenge 2012 dataset (4,000 patients, 48h, mortality labels).</w:t>
+              <w:t>[9]</w:t>
             </w:r>
           </w:p>
         </w:tc>
         <w:tc>
           <w:tcPr>
-            <w:tcW w:type="dxa" w:w="2412"/>
+            <w:tcW w:type="dxa" w:w="2520"/>
           </w:tcPr>
           <w:p>
             <w:r/>
@@ -634,13 +795,13 @@
               <w:rPr>
                 <w:sz w:val="16"/>
               </w:rPr>
-              <w:t>Standard reproducible ICU mortality benchmark for windowed, split, holdout evaluation.</w:t>
+              <w:t>PhysioNet Challenge 2012 (4,000 patients, 48 h, mortality labels).</w:t>
             </w:r>
           </w:p>
         </w:tc>
         <w:tc>
           <w:tcPr>
-            <w:tcW w:type="dxa" w:w="2412"/>
+            <w:tcW w:type="dxa" w:w="3096"/>
           </w:tcPr>
           <w:p>
             <w:r/>
@@ -648,13 +809,13 @@
               <w:rPr>
                 <w:sz w:val="16"/>
               </w:rPr>
-              <w:t>US-only, 2012-era, retrospective, sparse, biased vs live bedside data.</w:t>
+              <w:t>Standard reproducible ICU mortality benchmark.</w:t>
             </w:r>
           </w:p>
         </w:tc>
         <w:tc>
           <w:tcPr>
-            <w:tcW w:type="dxa" w:w="2412"/>
+            <w:tcW w:type="dxa" w:w="3096"/>
           </w:tcPr>
           <w:p>
             <w:r/>
@@ -662,7 +823,21 @@
               <w:rPr>
                 <w:sz w:val="16"/>
               </w:rPr>
-              <w:t>All modelling: 12 features, 90-min windows stride 15, patient splits, val AUC 0.840 + unseen set-B holdout AUC 0.844.</w:t>
+              <w:t>US-only, 2012-era, retrospective, sparse, biased.</w:t>
+            </w:r>
+          </w:p>
+        </w:tc>
+        <w:tc>
+          <w:tcPr>
+            <w:tcW w:type="dxa" w:w="3096"/>
+          </w:tcPr>
+          <w:p>
+            <w:r/>
+            <w:r>
+              <w:rPr>
+                <w:sz w:val="16"/>
+              </w:rPr>
+              <w:t>All modelling: 12 features, 90-min windows stride 15, val 0.840 + holdout 0.844.</w:t>
             </w:r>
           </w:p>
         </w:tc>
@@ -673,7 +848,7 @@
         <w:pStyle w:val="IntenseQuote"/>
       </w:pPr>
       <w:r>
-        <w:t>Note: performance numbers come from different cohorts and protocols and are reference points, not head-to-head comparisons with SynCura.</w:t>
+        <w:t>Note: numbers are reference points across different protocols, not direct comparisons with SynCura.</w:t>
       </w:r>
     </w:p>
     <w:p>
@@ -699,7 +874,7 @@
         <w:t xml:space="preserve">Zheng et al. (2025) — base paper — </w:t>
       </w:r>
       <w:r>
-        <w:t>Time-aware BiLSTM with attention gives hourly ICU risk (0.936 dynamic, 0.919 external). Hindsight bias inflates discharge scores; cross-hospital drop and no prospective trial limit claims. SynCura adapts the design to 90-minute past-only windows on PhysioNet 2012 with SHAP added.</w:t>
+        <w:t>Hourly ICU risk (0.936 dynamic, 0.919 external). Hindsight bias and cross-hospital drop limit claims. SynCura adapts to 90-minute past-only windows on PhysioNet 2012 with SHAP added.</w:t>
       </w:r>
     </w:p>
     <w:p>
@@ -713,7 +888,7 @@
         <w:t xml:space="preserve">Wang, Bai &amp; Jin (2026) — </w:t>
       </w:r>
       <w:r>
-        <w:t>Explainable LSTMs (AUC ~0.79–0.87) motivate feature explanations. SynCura pairs temporal attention with SHAP in the dashboard and explain endpoint.</w:t>
+        <w:t>Explainable LSTMs (AUC ~0.79–0.87). SynCura pairs temporal attention with SHAP in dashboard and explain endpoint.</w:t>
       </w:r>
     </w:p>
     <w:p>
@@ -727,7 +902,7 @@
         <w:t xml:space="preserve">Yan et al. (2026) — </w:t>
       </w:r>
       <w:r>
-        <w:t>Plain LSTM (AUC 0.802) beats newer sequence models but drops externally. SynCura keeps the simple LSTM and reports validation plus an unseen holdout.</w:t>
+        <w:t>Plain LSTM (0.802) beats newer models but drops externally. SynCura keeps simple LSTM and reports validation plus unseen holdout.</w:t>
       </w:r>
     </w:p>
     <w:p>
@@ -741,7 +916,7 @@
         <w:t xml:space="preserve">Sadanandan (2026) — </w:t>
       </w:r>
       <w:r>
-        <w:t>LSTM + ClinicalBERT (AUROC 0.7857) helps but adds cost; field range for structured-only models is 0.70–0.85. SynCura stays structured-only now, notes fusion later.</w:t>
+        <w:t>LSTM + ClinicalBERT (0.7857); field 0.70–0.85. SynCura stays structured-only now, notes fusion later.</w:t>
       </w:r>
     </w:p>
     <w:p>
@@ -755,7 +930,7 @@
         <w:t xml:space="preserve">Wu et al. (2024) — </w:t>
       </w:r>
       <w:r>
-        <w:t>Vitals-only LSTM (AUC 0.9263) is the closest input-scope ceiling. SynCura uses the same core vitals plus labs, attention, SHAP, and serving.</w:t>
+        <w:t>Vitals-only LSTM (0.9263) is the input-scope ceiling. SynCura uses same core vitals plus labs, attention, SHAP, serving.</w:t>
       </w:r>
     </w:p>
     <w:p>
@@ -769,7 +944,7 @@
         <w:t xml:space="preserve">Xie et al. (2025) — RealMIP — </w:t>
       </w:r>
       <w:r>
-        <w:t>Generative missing-data recovery (AUC ~0.957–0.968, multi-DB) is the robustness model to aim for after interpolation/baseline imputation.</w:t>
+        <w:t>Generative recovery (0.957–0.968, multi-DB) is the robustness target after interpolation.</w:t>
       </w:r>
     </w:p>
     <w:p>
@@ -783,7 +958,7 @@
         <w:t xml:space="preserve">Choi et al. (2020) — </w:t>
       </w:r>
       <w:r>
-        <w:t>Interpretable BiLSTM early warning (~0.880, beats NEWS2) supports the compare-against-NEWS2 evaluation with false alarms and lead time.</w:t>
+        <w:t>Interpretable BiLSTM warning (~0.880, beats NEWS2) supports NEWS2 comparison with false alarms and lead time.</w:t>
       </w:r>
     </w:p>
     <w:p>
@@ -797,7 +972,7 @@
         <w:t xml:space="preserve">Scheid et al. (2025) — </w:t>
       </w:r>
       <w:r>
-        <w:t>Wearable continuous prediction (~0.89) supports streaming monitoring but exposes sensor/deployment gaps; hence SynCura's prototype-only framing.</w:t>
+        <w:t>Wearables (~0.89) support streaming but expose sensor gaps; hence prototype-only framing.</w:t>
       </w:r>
     </w:p>
     <w:p>
@@ -811,7 +986,7 @@
         <w:t xml:space="preserve">PhysioNet 2012 — </w:t>
       </w:r>
       <w:r>
-        <w:t>Public benchmark used for all SynCura training/evaluation: 12 features, 90-min windows, patient splits, ensemble s48+c93+s45 (val 0.840, unseen holdout 0.844).</w:t>
+        <w:t>Benchmark for all SynCura training: 12 features, 90-min windows, ensemble s48+c93+s45 (val 0.840, holdout 0.844).</w:t>
       </w:r>
     </w:p>
     <w:p>
@@ -828,7 +1003,7 @@
     </w:p>
     <w:p>
       <w:r>
-        <w:t>Many studies optimise AUC but do not show the full streaming path: rolling input → risk score → temporal + feature explanation → API/dashboard → unseen-holdout evaluation with NEWS2, false-alarm, and lead-time reporting. SynCura targets that integration gap as a reproducible research prototype, explicitly deferring calibration, fairness, external, and prospective validation to future work.</w:t>
+        <w:t>Many studies optimise AUC but do not show the full streaming path: rolling input → risk score → temporal + feature explanation → API/dashboard → unseen-holdout evaluation with NEWS2, false-alarm, and lead-time reporting. SynCura targets that integration gap as a reproducible prototype, deferring calibration, fairness, external, and prospective validation to future work.</w:t>
       </w:r>
     </w:p>
     <w:p>
@@ -848,7 +1023,7 @@
         <w:pStyle w:val="ListNumber"/>
       </w:pPr>
       <w:r>
-        <w:t>Z. Zheng et al., Development and Validation of a Dynamic Real-Time Risk Prediction Model for ICU Patients Based on Longitudinal Irregular Data, JMIR 27:e69293, 2025.</w:t>
+        <w:t>Z. Zheng et al., Dynamic Real-Time Risk Prediction Model for ICU Patients Based on Longitudinal Irregular Data, JMIR 27:e69293, 2025. https://doi.org/10.2196/69293</w:t>
       </w:r>
     </w:p>
     <w:p>
@@ -864,7 +1039,7 @@
         <w:pStyle w:val="ListNumber"/>
       </w:pPr>
       <w:r>
-        <w:t>Z. Yan et al., Deep Learning-Based In-Hospital Mortality Prediction Using Long-Term Sequential Data in ICU Patients, PeerJ 14:e21631, 2026.</w:t>
+        <w:t>Z. Yan et al., Deep Learning-Based In-Hospital Mortality Prediction Using Long-Term Sequential Data in ICU Patients, PeerJ 14:e21631, 2026. https://doi.org/10.7717/peerj.21631</w:t>
       </w:r>
     </w:p>
     <w:p>
@@ -872,7 +1047,7 @@
         <w:pStyle w:val="ListNumber"/>
       </w:pPr>
       <w:r>
-        <w:t>B. Sadanandan, Multimodal Deep Learning for Early Prediction of Patient Deterioration in the ICU, arXiv:2603.14719, 2026.</w:t>
+        <w:t>B. Sadanandan, Multimodal Deep Learning for Early Prediction of Patient Deterioration in the ICU, arXiv:2603.14719, 2026. https://arxiv.org/abs/2603.14719</w:t>
       </w:r>
     </w:p>
     <w:p>
@@ -880,7 +1055,7 @@
         <w:pStyle w:val="ListNumber"/>
       </w:pPr>
       <w:r>
-        <w:t>Y. Wu et al., Revisiting the Potential Value of Vital Signs in the Real-Time Prediction of Mortality Risk in ICU Patients, J. Big Data 11:40, 2024.</w:t>
+        <w:t>Y. Wu et al., Revisiting the Potential Value of Vital Signs in Mortality Risk Prediction, J. Big Data 11:40, 2024. https://doi.org/10.1186/s40537-024-00896-8</w:t>
       </w:r>
     </w:p>
     <w:p>
@@ -888,7 +1063,7 @@
         <w:pStyle w:val="ListNumber"/>
       </w:pPr>
       <w:r>
-        <w:t>P. Xie et al., Unlocking the Potential of Real-Time ICU Mortality Prediction, npj Digital Medicine 8:733, 2025.</w:t>
+        <w:t>P. Xie et al., Unlocking Real-Time ICU Mortality Prediction, npj Digital Medicine 8:733, 2025. https://doi.org/10.1038/s41746-025-02114-y</w:t>
       </w:r>
     </w:p>
     <w:p>
@@ -896,7 +1071,7 @@
         <w:pStyle w:val="ListNumber"/>
       </w:pPr>
       <w:r>
-        <w:t>E. Choi et al., Deep Interpretable Early Warning System for the Detection of Clinical Deterioration, IEEE J-BHI 24(9), 2020.</w:t>
+        <w:t>E. Choi et al., Deep Interpretable Early Warning System for Clinical Deterioration, IEEE J-BHI 24(9), 2020.</w:t>
       </w:r>
     </w:p>
     <w:p>
@@ -904,7 +1079,7 @@
         <w:pStyle w:val="ListNumber"/>
       </w:pPr>
       <w:r>
-        <w:t>M. R. Scheid et al., Clinical Wearable Deep Learning Based Continuous In-Hospital Deterioration Prediction Model, Nature Communications 16:9513, 2025.</w:t>
+        <w:t>M. R. Scheid et al., Clinical Wearable Deep Learning Based Continuous Deterioration Prediction, Nature Communications 16:9513, 2025.</w:t>
       </w:r>
     </w:p>
     <w:p>
@@ -915,9 +1090,14 @@
         <w:t>PhysioNet, Computing in Cardiology Challenge 2012, https://physionet.org/content/challenge-2012/</w:t>
       </w:r>
     </w:p>
+    <w:p>
+      <w:r>
+        <w:t>Consistency check (2026-09-18): references match ppt/SynCura_Deck_V3_FINAL.pptx Slide 15; SynCura results match ppt/figs/metrics.json (val 0.840, holdout 0.844, CI 0.836–0.852).</w:t>
+      </w:r>
+    </w:p>
     <w:sectPr>
       <w:pgSz w:w="12240" w:h="15840"/>
-      <w:pgMar w:top="1440" w:right="1296" w:bottom="1440" w:left="1296" w:header="720" w:footer="720" w:gutter="0"/>
+      <w:pgMar w:top="1440" w:right="1008" w:bottom="1440" w:left="1008" w:header="720" w:footer="720" w:gutter="0"/>
       <w:cols w:space="720"/>
       <w:docGrid w:linePitch="360"/>
     </w:sectPr>

</xml_diff>

<commit_message>
polish literature review to 10/10
</commit_message>
<xml_diff>
--- a/LITERATURE_REVIEW_DOCUMENT.docx
+++ b/LITERATURE_REVIEW_DOCUMENT.docx
@@ -26,7 +26,7 @@
           <w:color w:val="1F4E79"/>
           <w:sz w:val="36"/>
         </w:rPr>
-        <w:t>SynCura — Literature Review Document</w:t>
+        <w:t>SynCura - Literature Review Document</w:t>
       </w:r>
     </w:p>
     <w:p>
@@ -49,12 +49,12 @@
           <w:i/>
           <w:sz w:val="18"/>
         </w:rPr>
-        <w:t>Team: Abdul Ahad Ikkeri (4PA24CS002), Fathima Reeha (4PA24CS026), Fizan Feroz (4PA24CS032) | Date: 2026-09-18 | Version: 1.1</w:t>
+        <w:t>Team: Abdul Ahad Ikkeri (4PA24CS002), Fathima Reeha (4PA24CS026), Fizan Feroz (4PA24CS032) | Date: 2026-09-19 | Version: 1.2</w:t>
       </w:r>
     </w:p>
     <w:p>
       <w:r>
-        <w:t>This document reviews the base paper and supporting works used in SynCura. For each study it records (1) key findings, (2) limitations for real-time clinical use, and (3) the specific idea adopted by SynCura. Table 1 is the comparative summary; detailed notes follow.</w:t>
+        <w:t>This document reviews the base paper and supporting works used in SynCura. For each study it records (1) key findings, (2) limitations for real-time clinical use, and (3) the specific idea adopted by SynCura. The comparative summary is Table 1 in Section 1; detailed per-study notes follow in Section 2 (each entry cross-references its Table 1 row by number).</w:t>
       </w:r>
     </w:p>
     <w:p>
@@ -70,7 +70,7 @@
         <w:pStyle w:val="IntenseQuote"/>
       </w:pPr>
       <w:r>
-        <w:t>How to read the numbers. AUROC/AUC values come from different cohorts, labels, windows, and splits; they are reference points, not head-to-head comparisons. SynCura: validation AUC 0.840, fresh unseen 20% set-B holdout AUC 0.844 (95% CI 0.836–0.852), per ppt/figs/metrics.json.</w:t>
+        <w:t>How to read the numbers. AUROC/AUC values come from different cohorts, labels, windows, and splits; they are reference points, not head-to-head comparisons. SynCura: validation AUC 0.840, fresh unseen 20% set-B holdout AUC 0.844 (95% CI 0.836-0.852), per ppt/figs/metrics.json.</w:t>
       </w:r>
     </w:p>
     <w:p>
@@ -87,8 +87,19 @@
     </w:p>
     <w:p>
       <w:r>
-        <w:t>Table 1. Findings, limitations, and what SynCura used from each reviewed work.</w:t>
+        <w:t>Table 1. Findings, limitations, and what SynCura used from each reviewed work. Detailed notes in Section 2 reference these rows by number.</w:t>
       </w:r>
+    </w:p>
+    <w:p>
+      <w:pPr>
+        <w:sectPr>
+          <w:footerReference w:type="default" r:id="rId13"/>
+          <w:pgSz w:w="12240" w:h="15840"/>
+          <w:pgMar w:top="1440" w:right="1296" w:bottom="1440" w:left="1296" w:header="720" w:footer="720" w:gutter="0"/>
+          <w:cols w:space="720"/>
+          <w:docGrid w:linePitch="360"/>
+        </w:sectPr>
+      </w:pPr>
     </w:p>
     <w:tbl>
       <w:tblPr>
@@ -98,11 +109,11 @@
         <w:tblLook w:firstColumn="1" w:firstRow="1" w:lastColumn="0" w:lastRow="0" w:noHBand="0" w:noVBand="1" w:val="04A0"/>
       </w:tblPr>
       <w:tblGrid>
-        <w:gridCol w:w="2045"/>
-        <w:gridCol w:w="2045"/>
-        <w:gridCol w:w="2045"/>
-        <w:gridCol w:w="2045"/>
-        <w:gridCol w:w="2045"/>
+        <w:gridCol w:w="2822"/>
+        <w:gridCol w:w="2822"/>
+        <w:gridCol w:w="2822"/>
+        <w:gridCol w:w="2822"/>
+        <w:gridCol w:w="2822"/>
       </w:tblGrid>
       <w:tr>
         <w:trPr>
@@ -110,7 +121,7 @@
         </w:trPr>
         <w:tc>
           <w:tcPr>
-            <w:tcW w:type="dxa" w:w="648"/>
+            <w:tcW w:type="dxa" w:w="792"/>
             <w:shd w:val="clear" w:fill="1F4E79"/>
           </w:tcPr>
           <w:p>
@@ -127,7 +138,7 @@
         </w:tc>
         <w:tc>
           <w:tcPr>
-            <w:tcW w:type="dxa" w:w="2520"/>
+            <w:tcW w:type="dxa" w:w="3024"/>
             <w:shd w:val="clear" w:fill="1F4E79"/>
           </w:tcPr>
           <w:p>
@@ -144,7 +155,7 @@
         </w:tc>
         <w:tc>
           <w:tcPr>
-            <w:tcW w:type="dxa" w:w="3096"/>
+            <w:tcW w:type="dxa" w:w="3600"/>
             <w:shd w:val="clear" w:fill="1F4E79"/>
           </w:tcPr>
           <w:p>
@@ -161,7 +172,7 @@
         </w:tc>
         <w:tc>
           <w:tcPr>
-            <w:tcW w:type="dxa" w:w="3096"/>
+            <w:tcW w:type="dxa" w:w="3600"/>
             <w:shd w:val="clear" w:fill="1F4E79"/>
           </w:tcPr>
           <w:p>
@@ -178,7 +189,7 @@
         </w:tc>
         <w:tc>
           <w:tcPr>
-            <w:tcW w:type="dxa" w:w="3096"/>
+            <w:tcW w:type="dxa" w:w="3600"/>
             <w:shd w:val="clear" w:fill="1F4E79"/>
           </w:tcPr>
           <w:p>
@@ -197,13 +208,13 @@
       <w:tr>
         <w:tc>
           <w:tcPr>
-            <w:tcW w:type="dxa" w:w="648"/>
+            <w:tcW w:type="dxa" w:w="792"/>
           </w:tcPr>
           <w:p>
             <w:r/>
             <w:r>
               <w:rPr>
-                <w:sz w:val="16"/>
+                <w:sz w:val="18"/>
               </w:rPr>
               <w:t>[1]</w:t>
             </w:r>
@@ -211,13 +222,13 @@
         </w:tc>
         <w:tc>
           <w:tcPr>
-            <w:tcW w:type="dxa" w:w="2520"/>
+            <w:tcW w:type="dxa" w:w="3024"/>
           </w:tcPr>
           <w:p>
             <w:r/>
             <w:r>
               <w:rPr>
-                <w:sz w:val="16"/>
+                <w:sz w:val="18"/>
               </w:rPr>
               <w:t>Zheng et al. (2025), JMIR 27:e69293. TBAL, 176,344 stays (MIMIC-IV + eICU).</w:t>
             </w:r>
@@ -225,13 +236,13 @@
         </w:tc>
         <w:tc>
           <w:tcPr>
-            <w:tcW w:type="dxa" w:w="3096"/>
+            <w:tcW w:type="dxa" w:w="3600"/>
           </w:tcPr>
           <w:p>
             <w:r/>
             <w:r>
               <w:rPr>
-                <w:sz w:val="16"/>
+                <w:sz w:val="18"/>
               </w:rPr>
               <w:t>Dynamic AUROC 0.936 (MIMIC-IV), 0.919 external eICU, recall 79.1%; hourly risk; time-aware attention.</w:t>
             </w:r>
@@ -239,13 +250,13 @@
         </w:tc>
         <w:tc>
           <w:tcPr>
-            <w:tcW w:type="dxa" w:w="3096"/>
+            <w:tcW w:type="dxa" w:w="3600"/>
           </w:tcPr>
           <w:p>
             <w:r/>
             <w:r>
               <w:rPr>
-                <w:sz w:val="16"/>
+                <w:sz w:val="18"/>
               </w:rPr>
               <w:t>Retrospective till discharge (0.989 at discharge = hindsight bias); cross-hospital ~0.81/0.76; no bedside trial; richer EMR than streaming allows.</w:t>
             </w:r>
@@ -253,13 +264,13 @@
         </w:tc>
         <w:tc>
           <w:tcPr>
-            <w:tcW w:type="dxa" w:w="3096"/>
+            <w:tcW w:type="dxa" w:w="3600"/>
           </w:tcPr>
           <w:p>
             <w:r/>
             <w:r>
               <w:rPr>
-                <w:sz w:val="16"/>
+                <w:sz w:val="18"/>
               </w:rPr>
               <w:t>Main template: 2-layer LSTM-96 + temporal attention; 90-min past-only windows; attention for temporal explanation; SHAP added.</w:t>
             </w:r>
@@ -269,13 +280,13 @@
       <w:tr>
         <w:tc>
           <w:tcPr>
-            <w:tcW w:type="dxa" w:w="648"/>
+            <w:tcW w:type="dxa" w:w="792"/>
           </w:tcPr>
           <w:p>
             <w:r/>
             <w:r>
               <w:rPr>
-                <w:sz w:val="16"/>
+                <w:sz w:val="18"/>
               </w:rPr>
               <w:t>[2]</w:t>
             </w:r>
@@ -283,13 +294,13 @@
         </w:tc>
         <w:tc>
           <w:tcPr>
-            <w:tcW w:type="dxa" w:w="2520"/>
+            <w:tcW w:type="dxa" w:w="3024"/>
           </w:tcPr>
           <w:p>
             <w:r/>
             <w:r>
               <w:rPr>
-                <w:sz w:val="16"/>
+                <w:sz w:val="18"/>
               </w:rPr>
               <w:t>Wang, Bai &amp; Jin (2026), Front. Physiol. 17. Explainable ICU models.</w:t>
             </w:r>
@@ -297,27 +308,27 @@
         </w:tc>
         <w:tc>
           <w:tcPr>
-            <w:tcW w:type="dxa" w:w="3096"/>
+            <w:tcW w:type="dxa" w:w="3600"/>
           </w:tcPr>
           <w:p>
             <w:r/>
             <w:r>
               <w:rPr>
-                <w:sz w:val="16"/>
+                <w:sz w:val="18"/>
               </w:rPr>
-              <w:t>Explainable LSTM, AUC ~0.79–0.87; feature explanations aid review.</w:t>
+              <w:t>Explainable LSTM, AUC ~0.79-0.87; feature explanations aid review.</w:t>
             </w:r>
           </w:p>
         </w:tc>
         <w:tc>
           <w:tcPr>
-            <w:tcW w:type="dxa" w:w="3096"/>
+            <w:tcW w:type="dxa" w:w="3600"/>
           </w:tcPr>
           <w:p>
             <w:r/>
             <w:r>
               <w:rPr>
-                <w:sz w:val="16"/>
+                <w:sz w:val="18"/>
               </w:rPr>
               <w:t>Single-dataset; descriptive not causal; thin false-alarm/lead-time/calibration reporting.</w:t>
             </w:r>
@@ -325,13 +336,13 @@
         </w:tc>
         <w:tc>
           <w:tcPr>
-            <w:tcW w:type="dxa" w:w="3096"/>
+            <w:tcW w:type="dxa" w:w="3600"/>
           </w:tcPr>
           <w:p>
             <w:r/>
             <w:r>
               <w:rPr>
-                <w:sz w:val="16"/>
+                <w:sz w:val="18"/>
               </w:rPr>
               <w:t>Attention (when) + SHAP (which features) via dashboard and /patient/{id}/explain.</w:t>
             </w:r>
@@ -341,13 +352,13 @@
       <w:tr>
         <w:tc>
           <w:tcPr>
-            <w:tcW w:type="dxa" w:w="648"/>
+            <w:tcW w:type="dxa" w:w="792"/>
           </w:tcPr>
           <w:p>
             <w:r/>
             <w:r>
               <w:rPr>
-                <w:sz w:val="16"/>
+                <w:sz w:val="18"/>
               </w:rPr>
               <w:t>[3]</w:t>
             </w:r>
@@ -355,13 +366,13 @@
         </w:tc>
         <w:tc>
           <w:tcPr>
-            <w:tcW w:type="dxa" w:w="2520"/>
+            <w:tcW w:type="dxa" w:w="3024"/>
           </w:tcPr>
           <w:p>
             <w:r/>
             <w:r>
               <w:rPr>
-                <w:sz w:val="16"/>
+                <w:sz w:val="18"/>
               </w:rPr>
               <w:t>Yan et al. (2026), PeerJ 14:e21631. LSTM/GRU/RNN/Transformer/Informer.</w:t>
             </w:r>
@@ -369,27 +380,27 @@
         </w:tc>
         <w:tc>
           <w:tcPr>
-            <w:tcW w:type="dxa" w:w="3096"/>
+            <w:tcW w:type="dxa" w:w="3600"/>
           </w:tcPr>
           <w:p>
             <w:r/>
             <w:r>
               <w:rPr>
-                <w:sz w:val="16"/>
+                <w:sz w:val="18"/>
               </w:rPr>
-              <w:t>Plain LSTM best single, AUC 0.802 (95% CI 0.774–0.828); external below internal.</w:t>
+              <w:t>Plain LSTM best single, AUC 0.802 (95% CI 0.774-0.828); external below internal.</w:t>
             </w:r>
           </w:p>
         </w:tc>
         <w:tc>
           <w:tcPr>
-            <w:tcW w:type="dxa" w:w="3096"/>
+            <w:tcW w:type="dxa" w:w="3600"/>
           </w:tcPr>
           <w:p>
             <w:r/>
             <w:r>
               <w:rPr>
-                <w:sz w:val="16"/>
+                <w:sz w:val="18"/>
               </w:rPr>
               <w:t>Modest AUC; stacking adds complexity; retrospective, no deployment analysis.</w:t>
             </w:r>
@@ -397,13 +408,13 @@
         </w:tc>
         <w:tc>
           <w:tcPr>
-            <w:tcW w:type="dxa" w:w="3096"/>
+            <w:tcW w:type="dxa" w:w="3600"/>
           </w:tcPr>
           <w:p>
             <w:r/>
             <w:r>
               <w:rPr>
-                <w:sz w:val="16"/>
+                <w:sz w:val="18"/>
               </w:rPr>
               <w:t>Kept LSTM baseline; unseen-patient evaluation (fresh 20% set-B holdout).</w:t>
             </w:r>
@@ -413,13 +424,13 @@
       <w:tr>
         <w:tc>
           <w:tcPr>
-            <w:tcW w:type="dxa" w:w="648"/>
+            <w:tcW w:type="dxa" w:w="792"/>
           </w:tcPr>
           <w:p>
             <w:r/>
             <w:r>
               <w:rPr>
-                <w:sz w:val="16"/>
+                <w:sz w:val="18"/>
               </w:rPr>
               <w:t>[4]</w:t>
             </w:r>
@@ -427,13 +438,13 @@
         </w:tc>
         <w:tc>
           <w:tcPr>
-            <w:tcW w:type="dxa" w:w="2520"/>
+            <w:tcW w:type="dxa" w:w="3024"/>
           </w:tcPr>
           <w:p>
             <w:r/>
             <w:r>
               <w:rPr>
-                <w:sz w:val="16"/>
+                <w:sz w:val="18"/>
               </w:rPr>
               <w:t>Sadanandan (2026), arXiv:2603.14719. LSTM + ClinicalBERT, 74,822 stays.</w:t>
             </w:r>
@@ -441,27 +452,27 @@
         </w:tc>
         <w:tc>
           <w:tcPr>
-            <w:tcW w:type="dxa" w:w="3096"/>
+            <w:tcW w:type="dxa" w:w="3600"/>
           </w:tcPr>
           <w:p>
             <w:r/>
             <w:r>
               <w:rPr>
-                <w:sz w:val="16"/>
+                <w:sz w:val="18"/>
               </w:rPr>
-              <w:t>AUROC 0.7857, AUPRC 0.1908; structured-only field range 0.70–0.85.</w:t>
+              <w:t>AUROC 0.7857, AUPRC 0.1908; structured-only field range 0.70-0.85.</w:t>
             </w:r>
           </w:p>
         </w:tc>
         <w:tc>
           <w:tcPr>
-            <w:tcW w:type="dxa" w:w="3096"/>
+            <w:tcW w:type="dxa" w:w="3600"/>
           </w:tcPr>
           <w:p>
             <w:r/>
             <w:r>
               <w:rPr>
-                <w:sz w:val="16"/>
+                <w:sz w:val="18"/>
               </w:rPr>
               <w:t>Multimodal cost/privacy/compute/latency; low AUPRC; no bedside deploy.</w:t>
             </w:r>
@@ -469,13 +480,13 @@
         </w:tc>
         <w:tc>
           <w:tcPr>
-            <w:tcW w:type="dxa" w:w="3096"/>
+            <w:tcW w:type="dxa" w:w="3600"/>
           </w:tcPr>
           <w:p>
             <w:r/>
             <w:r>
               <w:rPr>
-                <w:sz w:val="16"/>
+                <w:sz w:val="18"/>
               </w:rPr>
               <w:t>Used range to avoid overclaiming; deferred notes fusion to future work.</w:t>
             </w:r>
@@ -485,13 +496,13 @@
       <w:tr>
         <w:tc>
           <w:tcPr>
-            <w:tcW w:type="dxa" w:w="648"/>
+            <w:tcW w:type="dxa" w:w="792"/>
           </w:tcPr>
           <w:p>
             <w:r/>
             <w:r>
               <w:rPr>
-                <w:sz w:val="16"/>
+                <w:sz w:val="18"/>
               </w:rPr>
               <w:t>[5]</w:t>
             </w:r>
@@ -499,13 +510,13 @@
         </w:tc>
         <w:tc>
           <w:tcPr>
-            <w:tcW w:type="dxa" w:w="2520"/>
+            <w:tcW w:type="dxa" w:w="3024"/>
           </w:tcPr>
           <w:p>
             <w:r/>
             <w:r>
               <w:rPr>
-                <w:sz w:val="16"/>
+                <w:sz w:val="18"/>
               </w:rPr>
               <w:t>Wu et al. (2024), J. Big Data 11:40. Vital-sign LSTM + external 889.</w:t>
             </w:r>
@@ -513,13 +524,13 @@
         </w:tc>
         <w:tc>
           <w:tcPr>
-            <w:tcW w:type="dxa" w:w="3096"/>
+            <w:tcW w:type="dxa" w:w="3600"/>
           </w:tcPr>
           <w:p>
             <w:r/>
             <w:r>
               <w:rPr>
-                <w:sz w:val="16"/>
+                <w:sz w:val="18"/>
               </w:rPr>
               <w:t>Vitals LSTM AUC 0.9263, above RF (~0.744); small vitals carry strong signal.</w:t>
             </w:r>
@@ -527,27 +538,27 @@
         </w:tc>
         <w:tc>
           <w:tcPr>
-            <w:tcW w:type="dxa" w:w="3096"/>
+            <w:tcW w:type="dxa" w:w="3600"/>
           </w:tcPr>
           <w:p>
             <w:r/>
             <w:r>
               <w:rPr>
-                <w:sz w:val="16"/>
+                <w:sz w:val="18"/>
               </w:rPr>
-              <w:t>Different cohort/pipeline — ceiling, not head-to-head; limited explainability.</w:t>
+              <w:t>Different cohort/pipeline - ceiling, not head-to-head; limited explainability.</w:t>
             </w:r>
           </w:p>
         </w:tc>
         <w:tc>
           <w:tcPr>
-            <w:tcW w:type="dxa" w:w="3096"/>
+            <w:tcW w:type="dxa" w:w="3600"/>
           </w:tcPr>
           <w:p>
             <w:r/>
             <w:r>
               <w:rPr>
-                <w:sz w:val="16"/>
+                <w:sz w:val="18"/>
               </w:rPr>
               <w:t>Same core vitals kept, extended to 12 vitals+labs with attention, SHAP, serving.</w:t>
             </w:r>
@@ -557,13 +568,13 @@
       <w:tr>
         <w:tc>
           <w:tcPr>
-            <w:tcW w:type="dxa" w:w="648"/>
+            <w:tcW w:type="dxa" w:w="792"/>
           </w:tcPr>
           <w:p>
             <w:r/>
             <w:r>
               <w:rPr>
-                <w:sz w:val="16"/>
+                <w:sz w:val="18"/>
               </w:rPr>
               <w:t>[6]</w:t>
             </w:r>
@@ -571,13 +582,13 @@
         </w:tc>
         <w:tc>
           <w:tcPr>
-            <w:tcW w:type="dxa" w:w="2520"/>
+            <w:tcW w:type="dxa" w:w="3024"/>
           </w:tcPr>
           <w:p>
             <w:r/>
             <w:r>
               <w:rPr>
-                <w:sz w:val="16"/>
+                <w:sz w:val="18"/>
               </w:rPr>
               <w:t>Xie et al. (2025), npj Digit. Med. 8:733. RealMIP recovery.</w:t>
             </w:r>
@@ -585,27 +596,27 @@
         </w:tc>
         <w:tc>
           <w:tcPr>
-            <w:tcW w:type="dxa" w:w="3096"/>
+            <w:tcW w:type="dxa" w:w="3600"/>
           </w:tcPr>
           <w:p>
             <w:r/>
             <w:r>
               <w:rPr>
-                <w:sz w:val="16"/>
+                <w:sz w:val="18"/>
               </w:rPr>
-              <w:t>AUC ~0.957–0.968 across eICU/MIMIC-IV/SICdb; real-time imputation helps.</w:t>
+              <w:t>AUC ~0.957-0.968 across eICU/MIMIC-IV/SICdb; real-time imputation helps.</w:t>
             </w:r>
           </w:p>
         </w:tc>
         <w:tc>
           <w:tcPr>
-            <w:tcW w:type="dxa" w:w="3096"/>
+            <w:tcW w:type="dxa" w:w="3600"/>
           </w:tcPr>
           <w:p>
             <w:r/>
             <w:r>
               <w:rPr>
-                <w:sz w:val="16"/>
+                <w:sz w:val="18"/>
               </w:rPr>
               <w:t>Needs multi-DB training; heavier than current prototype.</w:t>
             </w:r>
@@ -613,13 +624,13 @@
         </w:tc>
         <w:tc>
           <w:tcPr>
-            <w:tcW w:type="dxa" w:w="3096"/>
+            <w:tcW w:type="dxa" w:w="3600"/>
           </w:tcPr>
           <w:p>
             <w:r/>
             <w:r>
               <w:rPr>
-                <w:sz w:val="16"/>
+                <w:sz w:val="18"/>
               </w:rPr>
               <w:t>Roadmap beyond interpolation + train-only z-score; add external validation.</w:t>
             </w:r>
@@ -629,13 +640,13 @@
       <w:tr>
         <w:tc>
           <w:tcPr>
-            <w:tcW w:type="dxa" w:w="648"/>
+            <w:tcW w:type="dxa" w:w="792"/>
           </w:tcPr>
           <w:p>
             <w:r/>
             <w:r>
               <w:rPr>
-                <w:sz w:val="16"/>
+                <w:sz w:val="18"/>
               </w:rPr>
               <w:t>[7]</w:t>
             </w:r>
@@ -643,13 +654,13 @@
         </w:tc>
         <w:tc>
           <w:tcPr>
-            <w:tcW w:type="dxa" w:w="2520"/>
+            <w:tcW w:type="dxa" w:w="3024"/>
           </w:tcPr>
           <w:p>
             <w:r/>
             <w:r>
               <w:rPr>
-                <w:sz w:val="16"/>
+                <w:sz w:val="18"/>
               </w:rPr>
               <w:t>Choi et al. (2020), IEEE J-BHI 24(9). Interpretable BiLSTM warning.</w:t>
             </w:r>
@@ -657,13 +668,13 @@
         </w:tc>
         <w:tc>
           <w:tcPr>
-            <w:tcW w:type="dxa" w:w="3096"/>
+            <w:tcW w:type="dxa" w:w="3600"/>
           </w:tcPr>
           <w:p>
             <w:r/>
             <w:r>
               <w:rPr>
-                <w:sz w:val="16"/>
+                <w:sz w:val="18"/>
               </w:rPr>
               <w:t>AUROC ~0.880, beating NEWS2-style baseline; sequential over static.</w:t>
             </w:r>
@@ -671,13 +682,13 @@
         </w:tc>
         <w:tc>
           <w:tcPr>
-            <w:tcW w:type="dxa" w:w="3096"/>
+            <w:tcW w:type="dxa" w:w="3600"/>
           </w:tcPr>
           <w:p>
             <w:r/>
             <w:r>
               <w:rPr>
-                <w:sz w:val="16"/>
+                <w:sz w:val="18"/>
               </w:rPr>
               <w:t>Retrospective; associative attention; thin calibration/false-alarm analysis.</w:t>
             </w:r>
@@ -685,13 +696,13 @@
         </w:tc>
         <w:tc>
           <w:tcPr>
-            <w:tcW w:type="dxa" w:w="3096"/>
+            <w:tcW w:type="dxa" w:w="3600"/>
           </w:tcPr>
           <w:p>
             <w:r/>
             <w:r>
               <w:rPr>
-                <w:sz w:val="16"/>
+                <w:sz w:val="18"/>
               </w:rPr>
               <w:t>NEWS2 benchmark with sensitivity, specificity, precision, false alarms, lead time.</w:t>
             </w:r>
@@ -701,13 +712,13 @@
       <w:tr>
         <w:tc>
           <w:tcPr>
-            <w:tcW w:type="dxa" w:w="648"/>
+            <w:tcW w:type="dxa" w:w="792"/>
           </w:tcPr>
           <w:p>
             <w:r/>
             <w:r>
               <w:rPr>
-                <w:sz w:val="16"/>
+                <w:sz w:val="18"/>
               </w:rPr>
               <w:t>[8]</w:t>
             </w:r>
@@ -715,13 +726,13 @@
         </w:tc>
         <w:tc>
           <w:tcPr>
-            <w:tcW w:type="dxa" w:w="2520"/>
+            <w:tcW w:type="dxa" w:w="3024"/>
           </w:tcPr>
           <w:p>
             <w:r/>
             <w:r>
               <w:rPr>
-                <w:sz w:val="16"/>
+                <w:sz w:val="18"/>
               </w:rPr>
               <w:t>Scheid et al. (2025), Nat. Commun. 16:9513. Wearable continuous.</w:t>
             </w:r>
@@ -729,13 +740,13 @@
         </w:tc>
         <w:tc>
           <w:tcPr>
-            <w:tcW w:type="dxa" w:w="3096"/>
+            <w:tcW w:type="dxa" w:w="3600"/>
           </w:tcPr>
           <w:p>
             <w:r/>
             <w:r>
               <w:rPr>
-                <w:sz w:val="16"/>
+                <w:sz w:val="18"/>
               </w:rPr>
               <w:t>Wearables ~0.89 AUROC with long lead time in-setting.</w:t>
             </w:r>
@@ -743,13 +754,13 @@
         </w:tc>
         <w:tc>
           <w:tcPr>
-            <w:tcW w:type="dxa" w:w="3096"/>
+            <w:tcW w:type="dxa" w:w="3600"/>
           </w:tcPr>
           <w:p>
             <w:r/>
             <w:r>
               <w:rPr>
-                <w:sz w:val="16"/>
+                <w:sz w:val="18"/>
               </w:rPr>
               <w:t>Noise, dropouts, irregular sampling, integration gaps.</w:t>
             </w:r>
@@ -757,15 +768,15 @@
         </w:tc>
         <w:tc>
           <w:tcPr>
-            <w:tcW w:type="dxa" w:w="3096"/>
+            <w:tcW w:type="dxa" w:w="3600"/>
           </w:tcPr>
           <w:p>
             <w:r/>
             <w:r>
               <w:rPr>
-                <w:sz w:val="16"/>
+                <w:sz w:val="18"/>
               </w:rPr>
-              <w:t>SENSE→INGEST→SCORE→ACT (ESP32+MAX30105, FastAPI/SQLite, 0–100, dashboard/alerts, HTTP+MQTT); prototype-only disclaimer.</w:t>
+              <w:t>SENSE-&gt;INGEST-&gt;SCORE-&gt;ACT (ESP32+MAX30105, FastAPI/SQLite, 0-100, dashboard/alerts, HTTP+MQTT); prototype-only disclaimer.</w:t>
             </w:r>
           </w:p>
         </w:tc>
@@ -773,13 +784,13 @@
       <w:tr>
         <w:tc>
           <w:tcPr>
-            <w:tcW w:type="dxa" w:w="648"/>
+            <w:tcW w:type="dxa" w:w="792"/>
           </w:tcPr>
           <w:p>
             <w:r/>
             <w:r>
               <w:rPr>
-                <w:sz w:val="16"/>
+                <w:sz w:val="18"/>
               </w:rPr>
               <w:t>[9]</w:t>
             </w:r>
@@ -787,13 +798,13 @@
         </w:tc>
         <w:tc>
           <w:tcPr>
-            <w:tcW w:type="dxa" w:w="2520"/>
+            <w:tcW w:type="dxa" w:w="3024"/>
           </w:tcPr>
           <w:p>
             <w:r/>
             <w:r>
               <w:rPr>
-                <w:sz w:val="16"/>
+                <w:sz w:val="18"/>
               </w:rPr>
               <w:t>PhysioNet Challenge 2012 (4,000 patients, 48 h, mortality labels).</w:t>
             </w:r>
@@ -801,13 +812,13 @@
         </w:tc>
         <w:tc>
           <w:tcPr>
-            <w:tcW w:type="dxa" w:w="3096"/>
+            <w:tcW w:type="dxa" w:w="3600"/>
           </w:tcPr>
           <w:p>
             <w:r/>
             <w:r>
               <w:rPr>
-                <w:sz w:val="16"/>
+                <w:sz w:val="18"/>
               </w:rPr>
               <w:t>Standard reproducible ICU mortality benchmark.</w:t>
             </w:r>
@@ -815,13 +826,13 @@
         </w:tc>
         <w:tc>
           <w:tcPr>
-            <w:tcW w:type="dxa" w:w="3096"/>
+            <w:tcW w:type="dxa" w:w="3600"/>
           </w:tcPr>
           <w:p>
             <w:r/>
             <w:r>
               <w:rPr>
-                <w:sz w:val="16"/>
+                <w:sz w:val="18"/>
               </w:rPr>
               <w:t>US-only, 2012-era, retrospective, sparse, biased.</w:t>
             </w:r>
@@ -829,13 +840,13 @@
         </w:tc>
         <w:tc>
           <w:tcPr>
-            <w:tcW w:type="dxa" w:w="3096"/>
+            <w:tcW w:type="dxa" w:w="3600"/>
           </w:tcPr>
           <w:p>
             <w:r/>
             <w:r>
               <w:rPr>
-                <w:sz w:val="16"/>
+                <w:sz w:val="18"/>
               </w:rPr>
               <w:t>All modelling: 12 features, 90-min windows stride 15, val 0.840 + holdout 0.844.</w:t>
             </w:r>
@@ -853,6 +864,18 @@
     </w:p>
     <w:p>
       <w:pPr>
+        <w:sectPr>
+          <w:headerReference w:type="default" r:id="rId9"/>
+          <w:footerReference w:type="default" r:id="rId10"/>
+          <w:pgSz w:w="15840" w:h="12240" w:orient="landscape"/>
+          <w:pgMar w:top="1440" w:right="864" w:bottom="1440" w:left="864" w:header="720" w:footer="720" w:gutter="0"/>
+          <w:cols w:space="720"/>
+          <w:docGrid w:linePitch="360"/>
+        </w:sectPr>
+      </w:pPr>
+    </w:p>
+    <w:p>
+      <w:pPr>
         <w:pStyle w:val="Heading1"/>
       </w:pPr>
       <w:r>
@@ -860,7 +883,7 @@
           <w:color w:val="1F4E79"/>
           <w:sz w:val="32"/>
         </w:rPr>
-        <w:t>2. Detailed notes</w:t>
+        <w:t>2. Detailed notes (companion to Table 1)</w:t>
       </w:r>
     </w:p>
     <w:p>
@@ -871,10 +894,43 @@
         <w:rPr>
           <w:b/>
         </w:rPr>
-        <w:t xml:space="preserve">Zheng et al. (2025) — base paper — </w:t>
+        <w:t xml:space="preserve">[1] Zheng et al. (2025) - base paper </w:t>
       </w:r>
       <w:r>
-        <w:t>Hourly ICU risk (0.936 dynamic, 0.919 external). Hindsight bias and cross-hospital drop limit claims. SynCura adapts to 90-minute past-only windows on PhysioNet 2012 with SHAP added.</w:t>
+        <w:rPr>
+          <w:b/>
+        </w:rPr>
+        <w:t xml:space="preserve">Approach: </w:t>
+      </w:r>
+      <w:r>
+        <w:t xml:space="preserve">Approach: time-aware BiLSTM with attention over irregular EMR (vitals, labs, medications), hourly updates, 176,344 MIMIC-IV stays + eICU cross-validation. </w:t>
+      </w:r>
+      <w:r>
+        <w:rPr>
+          <w:b/>
+        </w:rPr>
+        <w:t xml:space="preserve">Findings: </w:t>
+      </w:r>
+      <w:r>
+        <w:t xml:space="preserve">Findings: hourly risk, dynamic AUROC 0.936 internal / 0.919 external, high recall; attention gives time-level interpretability. </w:t>
+      </w:r>
+      <w:r>
+        <w:rPr>
+          <w:b/>
+        </w:rPr>
+        <w:t xml:space="preserve">Limitations: </w:t>
+      </w:r>
+      <w:r>
+        <w:t xml:space="preserve">Limitations: retrospective; 0.989 at discharge reflects hindsight bias; cross-hospital drop; no bedside trial; richer inputs than streaming allows. </w:t>
+      </w:r>
+      <w:r>
+        <w:rPr>
+          <w:b/>
+        </w:rPr>
+        <w:t xml:space="preserve">Adopted: </w:t>
+      </w:r>
+      <w:r>
+        <w:t xml:space="preserve">Adopted: attention-LSTM design as 2-layer LSTM-96 + additive attention; 90-minute past-only windows; SHAP added for feature explanation; unseen holdout evaluation. </w:t>
       </w:r>
     </w:p>
     <w:p>
@@ -885,10 +941,43 @@
         <w:rPr>
           <w:b/>
         </w:rPr>
-        <w:t xml:space="preserve">Wang, Bai &amp; Jin (2026) — </w:t>
+        <w:t xml:space="preserve">[2] Wang, Bai &amp; Jin (2026) </w:t>
       </w:r>
       <w:r>
-        <w:t>Explainable LSTMs (AUC ~0.79–0.87). SynCura pairs temporal attention with SHAP in dashboard and explain endpoint.</w:t>
+        <w:rPr>
+          <w:b/>
+        </w:rPr>
+        <w:t xml:space="preserve">Approach: </w:t>
+      </w:r>
+      <w:r>
+        <w:t xml:space="preserve">Approach: explainable LSTM-family models for ICU outcome prediction with feature attribution. </w:t>
+      </w:r>
+      <w:r>
+        <w:rPr>
+          <w:b/>
+        </w:rPr>
+        <w:t xml:space="preserve">Findings: </w:t>
+      </w:r>
+      <w:r>
+        <w:t xml:space="preserve">Findings: competitive discrimination (AUC ~0.79-0.87) with explanations for clinical review. </w:t>
+      </w:r>
+      <w:r>
+        <w:rPr>
+          <w:b/>
+        </w:rPr>
+        <w:t xml:space="preserve">Limitations: </w:t>
+      </w:r>
+      <w:r>
+        <w:t xml:space="preserve">Limitations: single-dataset; descriptive, not causal; thin deployment metrics. </w:t>
+      </w:r>
+      <w:r>
+        <w:rPr>
+          <w:b/>
+        </w:rPr>
+        <w:t xml:space="preserve">Adopted: </w:t>
+      </w:r>
+      <w:r>
+        <w:t xml:space="preserve">Adopted: dual explanation (attention = when, SHAP = which features) served via dashboard and explain endpoint. </w:t>
       </w:r>
     </w:p>
     <w:p>
@@ -899,10 +988,43 @@
         <w:rPr>
           <w:b/>
         </w:rPr>
-        <w:t xml:space="preserve">Yan et al. (2026) — </w:t>
+        <w:t xml:space="preserve">[3] Yan et al. (2026) </w:t>
       </w:r>
       <w:r>
-        <w:t>Plain LSTM (0.802) beats newer models but drops externally. SynCura keeps simple LSTM and reports validation plus unseen holdout.</w:t>
+        <w:rPr>
+          <w:b/>
+        </w:rPr>
+        <w:t xml:space="preserve">Approach: </w:t>
+      </w:r>
+      <w:r>
+        <w:t xml:space="preserve">Approach: LSTM/GRU/RNN/Transformer/Informer + stacking on long-term ICU sequences with multi-centre validation. </w:t>
+      </w:r>
+      <w:r>
+        <w:rPr>
+          <w:b/>
+        </w:rPr>
+        <w:t xml:space="preserve">Findings: </w:t>
+      </w:r>
+      <w:r>
+        <w:t xml:space="preserve">Findings: plain LSTM best single (AUC 0.802); external scores below internal. </w:t>
+      </w:r>
+      <w:r>
+        <w:rPr>
+          <w:b/>
+        </w:rPr>
+        <w:t xml:space="preserve">Limitations: </w:t>
+      </w:r>
+      <w:r>
+        <w:t xml:space="preserve">Limitations: modest AUC; stacking costs complexity/latency. </w:t>
+      </w:r>
+      <w:r>
+        <w:rPr>
+          <w:b/>
+        </w:rPr>
+        <w:t xml:space="preserve">Adopted: </w:t>
+      </w:r>
+      <w:r>
+        <w:t xml:space="preserve">Adopted: simple 2-layer LSTM baseline; validation plus unseen set-B holdout reporting. </w:t>
       </w:r>
     </w:p>
     <w:p>
@@ -913,10 +1035,43 @@
         <w:rPr>
           <w:b/>
         </w:rPr>
-        <w:t xml:space="preserve">Sadanandan (2026) — </w:t>
+        <w:t xml:space="preserve">[4] Sadanandan (2026) </w:t>
       </w:r>
       <w:r>
-        <w:t>LSTM + ClinicalBERT (0.7857); field 0.70–0.85. SynCura stays structured-only now, notes fusion later.</w:t>
+        <w:rPr>
+          <w:b/>
+        </w:rPr>
+        <w:t xml:space="preserve">Approach: </w:t>
+      </w:r>
+      <w:r>
+        <w:t xml:space="preserve">Approach: BiLSTM time-series + ClinicalBERT notes with cross-modal attention (74,822 stays); plus review of 31 studies. </w:t>
+      </w:r>
+      <w:r>
+        <w:rPr>
+          <w:b/>
+        </w:rPr>
+        <w:t xml:space="preserve">Findings: </w:t>
+      </w:r>
+      <w:r>
+        <w:t xml:space="preserve">Findings: AUROC 0.7857; structured-only field range 0.70-0.85. </w:t>
+      </w:r>
+      <w:r>
+        <w:rPr>
+          <w:b/>
+        </w:rPr>
+        <w:t xml:space="preserve">Limitations: </w:t>
+      </w:r>
+      <w:r>
+        <w:t xml:space="preserve">Limitations: multimodal cost/privacy/compute/latency; low AUPRC. </w:t>
+      </w:r>
+      <w:r>
+        <w:rPr>
+          <w:b/>
+        </w:rPr>
+        <w:t xml:space="preserve">Adopted: </w:t>
+      </w:r>
+      <w:r>
+        <w:t xml:space="preserve">Adopted: range used to set realistic targets; note fusion deferred to future work. </w:t>
       </w:r>
     </w:p>
     <w:p>
@@ -927,10 +1082,43 @@
         <w:rPr>
           <w:b/>
         </w:rPr>
-        <w:t xml:space="preserve">Wu et al. (2024) — </w:t>
+        <w:t xml:space="preserve">[5] Wu et al. (2024) </w:t>
       </w:r>
       <w:r>
-        <w:t>Vitals-only LSTM (0.9263) is the input-scope ceiling. SynCura uses same core vitals plus labs, attention, SHAP, serving.</w:t>
+        <w:rPr>
+          <w:b/>
+        </w:rPr>
+        <w:t xml:space="preserve">Approach: </w:t>
+      </w:r>
+      <w:r>
+        <w:t xml:space="preserve">Approach: short-window mortality from SBP/DBP/HR/RR/Temp (33,798 MIMIC-III + 889 external); LSTM vs RF/Cox. </w:t>
+      </w:r>
+      <w:r>
+        <w:rPr>
+          <w:b/>
+        </w:rPr>
+        <w:t xml:space="preserve">Findings: </w:t>
+      </w:r>
+      <w:r>
+        <w:t xml:space="preserve">Findings: vitals LSTM AUC 0.9263, far above classical baselines. </w:t>
+      </w:r>
+      <w:r>
+        <w:rPr>
+          <w:b/>
+        </w:rPr>
+        <w:t xml:space="preserve">Limitations: </w:t>
+      </w:r>
+      <w:r>
+        <w:t xml:space="preserve">Limitations: different cohort/pipeline - a ceiling, not a head-to-head target. </w:t>
+      </w:r>
+      <w:r>
+        <w:rPr>
+          <w:b/>
+        </w:rPr>
+        <w:t xml:space="preserve">Adopted: </w:t>
+      </w:r>
+      <w:r>
+        <w:t xml:space="preserve">Adopted: core vitals kept and extended to 12 vitals+labs with attention, SHAP, and serving path. </w:t>
       </w:r>
     </w:p>
     <w:p>
@@ -941,10 +1129,43 @@
         <w:rPr>
           <w:b/>
         </w:rPr>
-        <w:t xml:space="preserve">Xie et al. (2025) — RealMIP — </w:t>
+        <w:t xml:space="preserve">[6] Xie et al. (2025) - RealMIP </w:t>
       </w:r>
       <w:r>
-        <w:t>Generative recovery (0.957–0.968, multi-DB) is the robustness target after interpolation.</w:t>
+        <w:rPr>
+          <w:b/>
+        </w:rPr>
+        <w:t xml:space="preserve">Approach: </w:t>
+      </w:r>
+      <w:r>
+        <w:t xml:space="preserve">Approach: generative real-time imputation of missing vitals/labs plus mortality prediction; 188 eICU centres, MIMIC-IV/SICdb validation. </w:t>
+      </w:r>
+      <w:r>
+        <w:rPr>
+          <w:b/>
+        </w:rPr>
+        <w:t xml:space="preserve">Findings: </w:t>
+      </w:r>
+      <w:r>
+        <w:t xml:space="preserve">Findings: AUC ~0.957-0.968 with strong transfer. </w:t>
+      </w:r>
+      <w:r>
+        <w:rPr>
+          <w:b/>
+        </w:rPr>
+        <w:t xml:space="preserve">Limitations: </w:t>
+      </w:r>
+      <w:r>
+        <w:t xml:space="preserve">Limitations: needs multi-DB training; heavier than a student prototype. </w:t>
+      </w:r>
+      <w:r>
+        <w:rPr>
+          <w:b/>
+        </w:rPr>
+        <w:t xml:space="preserve">Adopted: </w:t>
+      </w:r>
+      <w:r>
+        <w:t xml:space="preserve">Adopted: roadmap item beyond interpolation + train-only z-score, paired with external validation. </w:t>
       </w:r>
     </w:p>
     <w:p>
@@ -955,10 +1176,43 @@
         <w:rPr>
           <w:b/>
         </w:rPr>
-        <w:t xml:space="preserve">Choi et al. (2020) — </w:t>
+        <w:t xml:space="preserve">[7] Choi et al. (2020) </w:t>
       </w:r>
       <w:r>
-        <w:t>Interpretable BiLSTM warning (~0.880, beats NEWS2) supports NEWS2 comparison with false alarms and lead time.</w:t>
+        <w:rPr>
+          <w:b/>
+        </w:rPr>
+        <w:t xml:space="preserve">Approach: </w:t>
+      </w:r>
+      <w:r>
+        <w:t xml:space="preserve">Approach: BiLSTM + attention early-warning system benchmarked against NEWS2. </w:t>
+      </w:r>
+      <w:r>
+        <w:rPr>
+          <w:b/>
+        </w:rPr>
+        <w:t xml:space="preserve">Findings: </w:t>
+      </w:r>
+      <w:r>
+        <w:t xml:space="preserve">Findings: AUROC ~0.880, beating NEWS2-style baseline. </w:t>
+      </w:r>
+      <w:r>
+        <w:rPr>
+          <w:b/>
+        </w:rPr>
+        <w:t xml:space="preserve">Limitations: </w:t>
+      </w:r>
+      <w:r>
+        <w:t xml:space="preserve">Limitations: retrospective; associative attention; thin calibration/false-alarm analysis. </w:t>
+      </w:r>
+      <w:r>
+        <w:rPr>
+          <w:b/>
+        </w:rPr>
+        <w:t xml:space="preserve">Adopted: </w:t>
+      </w:r>
+      <w:r>
+        <w:t xml:space="preserve">Adopted: early-warning framing and NEWS2 comparison with sensitivity, specificity, precision, false alarms, lead time. </w:t>
       </w:r>
     </w:p>
     <w:p>
@@ -969,10 +1223,43 @@
         <w:rPr>
           <w:b/>
         </w:rPr>
-        <w:t xml:space="preserve">Scheid et al. (2025) — </w:t>
+        <w:t xml:space="preserve">[8] Scheid et al. (2025) </w:t>
       </w:r>
       <w:r>
-        <w:t>Wearables (~0.89) support streaming but expose sensor gaps; hence prototype-only framing.</w:t>
+        <w:rPr>
+          <w:b/>
+        </w:rPr>
+        <w:t xml:space="preserve">Approach: </w:t>
+      </w:r>
+      <w:r>
+        <w:t xml:space="preserve">Approach: wearable deep learning for continuous in-hospital deterioration across hospitals. </w:t>
+      </w:r>
+      <w:r>
+        <w:rPr>
+          <w:b/>
+        </w:rPr>
+        <w:t xml:space="preserve">Findings: </w:t>
+      </w:r>
+      <w:r>
+        <w:t xml:space="preserve">Findings: ~0.89 AUROC with clinically useful lead time. </w:t>
+      </w:r>
+      <w:r>
+        <w:rPr>
+          <w:b/>
+        </w:rPr>
+        <w:t xml:space="preserve">Limitations: </w:t>
+      </w:r>
+      <w:r>
+        <w:t xml:space="preserve">Limitations: sensor noise, dropouts, irregular sampling, integration gaps. </w:t>
+      </w:r>
+      <w:r>
+        <w:rPr>
+          <w:b/>
+        </w:rPr>
+        <w:t xml:space="preserve">Adopted: </w:t>
+      </w:r>
+      <w:r>
+        <w:t xml:space="preserve">Adopted: SENSE-&gt;INGEST-&gt;SCORE-&gt;ACT architecture with HTTP/MQTT; prototype-only disclaimer retained. </w:t>
       </w:r>
     </w:p>
     <w:p>
@@ -983,10 +1270,43 @@
         <w:rPr>
           <w:b/>
         </w:rPr>
-        <w:t xml:space="preserve">PhysioNet 2012 — </w:t>
+        <w:t xml:space="preserve">[9] PhysioNet Challenge 2012 </w:t>
       </w:r>
       <w:r>
-        <w:t>Benchmark for all SynCura training: 12 features, 90-min windows, ensemble s48+c93+s45 (val 0.840, holdout 0.844).</w:t>
+        <w:rPr>
+          <w:b/>
+        </w:rPr>
+        <w:t xml:space="preserve">Approach: </w:t>
+      </w:r>
+      <w:r>
+        <w:t xml:space="preserve">Approach: 4,000 ICU patients, ~37 variables over first 48 h, binary mortality labels. </w:t>
+      </w:r>
+      <w:r>
+        <w:rPr>
+          <w:b/>
+        </w:rPr>
+        <w:t xml:space="preserve">Findings: </w:t>
+      </w:r>
+      <w:r>
+        <w:t xml:space="preserve">Findings: standard reproducible benchmark for windowed, split, holdout evaluation. </w:t>
+      </w:r>
+      <w:r>
+        <w:rPr>
+          <w:b/>
+        </w:rPr>
+        <w:t xml:space="preserve">Limitations: </w:t>
+      </w:r>
+      <w:r>
+        <w:t xml:space="preserve">Limitations: US-only, 2012-era, retrospective, sparse, biased vs live bedside data. </w:t>
+      </w:r>
+      <w:r>
+        <w:rPr>
+          <w:b/>
+        </w:rPr>
+        <w:t xml:space="preserve">Adopted: </w:t>
+      </w:r>
+      <w:r>
+        <w:t xml:space="preserve">Adopted: all SynCura training - 12 features, 90-min windows stride 15, patient splits, ensemble s48+c93+s45 (val 0.840, holdout 0.844). </w:t>
       </w:r>
     </w:p>
     <w:p>
@@ -1003,7 +1323,7 @@
     </w:p>
     <w:p>
       <w:r>
-        <w:t>Many studies optimise AUC but do not show the full streaming path: rolling input → risk score → temporal + feature explanation → API/dashboard → unseen-holdout evaluation with NEWS2, false-alarm, and lead-time reporting. SynCura targets that integration gap as a reproducible prototype, deferring calibration, fairness, external, and prospective validation to future work.</w:t>
+        <w:t>Many studies optimise AUC but do not show the full streaming path: rolling input -&gt; risk score -&gt; temporal + feature explanation -&gt; API/dashboard -&gt; unseen-holdout evaluation with NEWS2, false-alarm, and lead-time reporting. SynCura targets that integration gap as a reproducible prototype, deferring calibration, fairness, external, and prospective validation to future work (see Table 1, rows [1]-[9]).</w:t>
       </w:r>
     </w:p>
     <w:p>
@@ -1092,17 +1412,135 @@
     </w:p>
     <w:p>
       <w:r>
-        <w:t>Consistency check (2026-09-18): references match ppt/SynCura_Deck_V3_FINAL.pptx Slide 15; SynCura results match ppt/figs/metrics.json (val 0.840, holdout 0.844, CI 0.836–0.852).</w:t>
+        <w:t>Consistency check (2026-09-19): references match ppt/SynCura_Deck_V3_FINAL.pptx Slide 15; SynCura results match ppt/figs/metrics.json (val 0.840, holdout 0.844, CI 0.836-0.852).</w:t>
       </w:r>
     </w:p>
     <w:sectPr>
-      <w:pgSz w:w="12240" w:h="15840"/>
-      <w:pgMar w:top="1440" w:right="1008" w:bottom="1440" w:left="1008" w:header="720" w:footer="720" w:gutter="0"/>
+      <w:headerReference w:type="default" r:id="rId11"/>
+      <w:footerReference w:type="default" r:id="rId12"/>
+      <w:pgSz w:w="15840" w:h="12240"/>
+      <w:pgMar w:top="1440" w:right="1296" w:bottom="1440" w:left="1296" w:header="720" w:footer="720" w:gutter="0"/>
       <w:cols w:space="720"/>
       <w:docGrid w:linePitch="360"/>
     </w:sectPr>
   </w:body>
 </w:document>
+</file>
+
+<file path=word/footer1.xml><?xml version="1.0" encoding="utf-8"?>
+<w:ftr xmlns:m="http://schemas.openxmlformats.org/officeDocument/2006/math" xmlns:mc="http://schemas.openxmlformats.org/markup-compatibility/2006" xmlns:mo="http://schemas.microsoft.com/office/mac/office/2008/main" xmlns:mv="urn:schemas-microsoft-com:mac:vml" xmlns:o="urn:schemas-microsoft-com:office:office" xmlns:r="http://schemas.openxmlformats.org/officeDocument/2006/relationships" xmlns:v="urn:schemas-microsoft-com:vml" xmlns:w10="urn:schemas-microsoft-com:office:word" xmlns:w14="http://schemas.microsoft.com/office/word/2010/wordml" xmlns:w="http://schemas.openxmlformats.org/wordprocessingml/2006/main" xmlns:wne="http://schemas.microsoft.com/office/word/2006/wordml" xmlns:wp14="http://schemas.microsoft.com/office/word/2010/wordprocessingDrawing" xmlns:wp="http://schemas.openxmlformats.org/drawingml/2006/wordprocessingDrawing" xmlns:wpc="http://schemas.microsoft.com/office/word/2010/wordprocessingCanvas" xmlns:wpg="http://schemas.microsoft.com/office/word/2010/wordprocessingGroup" xmlns:wpi="http://schemas.microsoft.com/office/word/2010/wordprocessingInk" xmlns:wps="http://schemas.microsoft.com/office/word/2010/wordprocessingShape" mc:Ignorable="w14 wp14">
+  <w:p>
+    <w:pPr>
+      <w:pStyle w:val="Footer"/>
+      <w:jc w:val="center"/>
+    </w:pPr>
+    <w:r>
+      <w:rPr>
+        <w:color w:val="808080"/>
+        <w:sz w:val="18"/>
+      </w:rPr>
+      <w:fldChar w:fldCharType="begin"/>
+    </w:r>
+    <w:r>
+      <w:rPr>
+        <w:color w:val="808080"/>
+        <w:sz w:val="18"/>
+      </w:rPr>
+      <w:instrText xml:space="preserve">PAGE</w:instrText>
+    </w:r>
+    <w:r>
+      <w:rPr>
+        <w:color w:val="808080"/>
+        <w:sz w:val="18"/>
+      </w:rPr>
+      <w:fldChar w:fldCharType="end"/>
+    </w:r>
+  </w:p>
+</w:ftr>
+</file>
+
+<file path=word/footer2.xml><?xml version="1.0" encoding="utf-8"?>
+<w:ftr xmlns:m="http://schemas.openxmlformats.org/officeDocument/2006/math" xmlns:mc="http://schemas.openxmlformats.org/markup-compatibility/2006" xmlns:mo="http://schemas.microsoft.com/office/mac/office/2008/main" xmlns:mv="urn:schemas-microsoft-com:mac:vml" xmlns:o="urn:schemas-microsoft-com:office:office" xmlns:r="http://schemas.openxmlformats.org/officeDocument/2006/relationships" xmlns:v="urn:schemas-microsoft-com:vml" xmlns:w10="urn:schemas-microsoft-com:office:word" xmlns:w14="http://schemas.microsoft.com/office/word/2010/wordml" xmlns:w="http://schemas.openxmlformats.org/wordprocessingml/2006/main" xmlns:wne="http://schemas.microsoft.com/office/word/2006/wordml" xmlns:wp14="http://schemas.microsoft.com/office/word/2010/wordprocessingDrawing" xmlns:wp="http://schemas.openxmlformats.org/drawingml/2006/wordprocessingDrawing" xmlns:wpc="http://schemas.microsoft.com/office/word/2010/wordprocessingCanvas" xmlns:wpg="http://schemas.microsoft.com/office/word/2010/wordprocessingGroup" xmlns:wpi="http://schemas.microsoft.com/office/word/2010/wordprocessingInk" xmlns:wps="http://schemas.microsoft.com/office/word/2010/wordprocessingShape" mc:Ignorable="w14 wp14">
+  <w:p>
+    <w:pPr>
+      <w:pStyle w:val="Footer"/>
+      <w:jc w:val="center"/>
+    </w:pPr>
+    <w:r>
+      <w:rPr>
+        <w:color w:val="808080"/>
+        <w:sz w:val="18"/>
+      </w:rPr>
+      <w:fldChar w:fldCharType="begin"/>
+    </w:r>
+    <w:r>
+      <w:rPr>
+        <w:color w:val="808080"/>
+        <w:sz w:val="18"/>
+      </w:rPr>
+      <w:instrText xml:space="preserve">PAGE</w:instrText>
+    </w:r>
+    <w:r>
+      <w:rPr>
+        <w:color w:val="808080"/>
+        <w:sz w:val="18"/>
+      </w:rPr>
+      <w:fldChar w:fldCharType="end"/>
+    </w:r>
+  </w:p>
+</w:ftr>
+</file>
+
+<file path=word/footer3.xml><?xml version="1.0" encoding="utf-8"?>
+<w:ftr xmlns:m="http://schemas.openxmlformats.org/officeDocument/2006/math" xmlns:mc="http://schemas.openxmlformats.org/markup-compatibility/2006" xmlns:mo="http://schemas.microsoft.com/office/mac/office/2008/main" xmlns:mv="urn:schemas-microsoft-com:mac:vml" xmlns:o="urn:schemas-microsoft-com:office:office" xmlns:r="http://schemas.openxmlformats.org/officeDocument/2006/relationships" xmlns:v="urn:schemas-microsoft-com:vml" xmlns:w10="urn:schemas-microsoft-com:office:word" xmlns:w14="http://schemas.microsoft.com/office/word/2010/wordml" xmlns:w="http://schemas.openxmlformats.org/wordprocessingml/2006/main" xmlns:wne="http://schemas.microsoft.com/office/word/2006/wordml" xmlns:wp14="http://schemas.microsoft.com/office/word/2010/wordprocessingDrawing" xmlns:wp="http://schemas.openxmlformats.org/drawingml/2006/wordprocessingDrawing" xmlns:wpc="http://schemas.microsoft.com/office/word/2010/wordprocessingCanvas" xmlns:wpg="http://schemas.microsoft.com/office/word/2010/wordprocessingGroup" xmlns:wpi="http://schemas.microsoft.com/office/word/2010/wordprocessingInk" xmlns:wps="http://schemas.microsoft.com/office/word/2010/wordprocessingShape" mc:Ignorable="w14 wp14">
+  <w:p>
+    <w:pPr>
+      <w:pStyle w:val="Footer"/>
+      <w:jc w:val="center"/>
+    </w:pPr>
+    <w:r>
+      <w:rPr>
+        <w:color w:val="808080"/>
+        <w:sz w:val="18"/>
+      </w:rPr>
+      <w:fldChar w:fldCharType="begin"/>
+    </w:r>
+    <w:r>
+      <w:rPr>
+        <w:color w:val="808080"/>
+        <w:sz w:val="18"/>
+      </w:rPr>
+      <w:instrText xml:space="preserve">PAGE</w:instrText>
+    </w:r>
+    <w:r>
+      <w:rPr>
+        <w:color w:val="808080"/>
+        <w:sz w:val="18"/>
+      </w:rPr>
+      <w:fldChar w:fldCharType="end"/>
+    </w:r>
+  </w:p>
+</w:ftr>
+</file>
+
+<file path=word/header1.xml><?xml version="1.0" encoding="utf-8"?>
+<w:hdr xmlns:m="http://schemas.openxmlformats.org/officeDocument/2006/math" xmlns:mc="http://schemas.openxmlformats.org/markup-compatibility/2006" xmlns:mo="http://schemas.microsoft.com/office/mac/office/2008/main" xmlns:mv="urn:schemas-microsoft-com:mac:vml" xmlns:o="urn:schemas-microsoft-com:office:office" xmlns:r="http://schemas.openxmlformats.org/officeDocument/2006/relationships" xmlns:v="urn:schemas-microsoft-com:vml" xmlns:w10="urn:schemas-microsoft-com:office:word" xmlns:w14="http://schemas.microsoft.com/office/word/2010/wordml" xmlns:w="http://schemas.openxmlformats.org/wordprocessingml/2006/main" xmlns:wne="http://schemas.microsoft.com/office/word/2006/wordml" xmlns:wp14="http://schemas.microsoft.com/office/word/2010/wordprocessingDrawing" xmlns:wp="http://schemas.openxmlformats.org/drawingml/2006/wordprocessingDrawing" xmlns:wpc="http://schemas.microsoft.com/office/word/2010/wordprocessingCanvas" xmlns:wpg="http://schemas.microsoft.com/office/word/2010/wordprocessingGroup" xmlns:wpi="http://schemas.microsoft.com/office/word/2010/wordprocessingInk" xmlns:wps="http://schemas.microsoft.com/office/word/2010/wordprocessingShape" mc:Ignorable="w14 wp14">
+  <w:p>
+    <w:pPr>
+      <w:pStyle w:val="Header"/>
+    </w:pPr>
+  </w:p>
+</w:hdr>
+</file>
+
+<file path=word/header2.xml><?xml version="1.0" encoding="utf-8"?>
+<w:hdr xmlns:m="http://schemas.openxmlformats.org/officeDocument/2006/math" xmlns:mc="http://schemas.openxmlformats.org/markup-compatibility/2006" xmlns:mo="http://schemas.microsoft.com/office/mac/office/2008/main" xmlns:mv="urn:schemas-microsoft-com:mac:vml" xmlns:o="urn:schemas-microsoft-com:office:office" xmlns:r="http://schemas.openxmlformats.org/officeDocument/2006/relationships" xmlns:v="urn:schemas-microsoft-com:vml" xmlns:w10="urn:schemas-microsoft-com:office:word" xmlns:w14="http://schemas.microsoft.com/office/word/2010/wordml" xmlns:w="http://schemas.openxmlformats.org/wordprocessingml/2006/main" xmlns:wne="http://schemas.microsoft.com/office/word/2006/wordml" xmlns:wp14="http://schemas.microsoft.com/office/word/2010/wordprocessingDrawing" xmlns:wp="http://schemas.openxmlformats.org/drawingml/2006/wordprocessingDrawing" xmlns:wpc="http://schemas.microsoft.com/office/word/2010/wordprocessingCanvas" xmlns:wpg="http://schemas.microsoft.com/office/word/2010/wordprocessingGroup" xmlns:wpi="http://schemas.microsoft.com/office/word/2010/wordprocessingInk" xmlns:wps="http://schemas.microsoft.com/office/word/2010/wordprocessingShape" mc:Ignorable="w14 wp14">
+  <w:p>
+    <w:pPr>
+      <w:pStyle w:val="Header"/>
+    </w:pPr>
+  </w:p>
+</w:hdr>
 </file>
 
 <file path=word/numbering.xml><?xml version="1.0" encoding="utf-8"?>

</xml_diff>

<commit_message>
reorder review table: used, findings, limitations; title+author study cells
</commit_message>
<xml_diff>
--- a/LITERATURE_REVIEW_DOCUMENT.docx
+++ b/LITERATURE_REVIEW_DOCUMENT.docx
@@ -54,7 +54,7 @@
     </w:p>
     <w:p>
       <w:r>
-        <w:t>This document reviews the base paper and supporting works used in SynCura. For each study it records (1) key findings, (2) limitations for real-time clinical use, and (3) the specific idea adopted by SynCura. The comparative summary is Table 1 in Section 1; detailed per-study notes follow in Section 2 (each entry cross-references its Table 1 row by number).</w:t>
+        <w:t>This document reviews the base paper and supporting works used in SynCura. For each study it records (1) what SynCura used, (2) key findings in short plain-language points, and (3) limitations in short plain-language points. The comparative summary is Table 1 in Section 1; detailed per-study notes follow in Section 2 (each entry cross-references its Table 1 row by number).</w:t>
       </w:r>
     </w:p>
     <w:p>
@@ -87,7 +87,7 @@
     </w:p>
     <w:p>
       <w:r>
-        <w:t>Table 1. Findings, limitations, and what SynCura used from each reviewed work. Detailed notes in Section 2 reference these rows by number.</w:t>
+        <w:t>Table 1. What SynCura used, key findings, and limitations for each reviewed work. Detailed notes in Section 2 reference these rows by number.</w:t>
       </w:r>
     </w:p>
     <w:p>
@@ -121,7 +121,7 @@
         </w:trPr>
         <w:tc>
           <w:tcPr>
-            <w:tcW w:type="dxa" w:w="792"/>
+            <w:tcW w:type="dxa" w:w="720"/>
             <w:shd w:val="clear" w:fill="1F4E79"/>
           </w:tcPr>
           <w:p>
@@ -138,7 +138,7 @@
         </w:tc>
         <w:tc>
           <w:tcPr>
-            <w:tcW w:type="dxa" w:w="3024"/>
+            <w:tcW w:type="dxa" w:w="3384"/>
             <w:shd w:val="clear" w:fill="1F4E79"/>
           </w:tcPr>
           <w:p>
@@ -149,13 +149,13 @@
                 <w:color w:val="FFFFFF"/>
                 <w:sz w:val="18"/>
               </w:rPr>
-              <w:t>Study</w:t>
+              <w:t>Study (Authors + Title)</w:t>
             </w:r>
           </w:p>
         </w:tc>
         <w:tc>
           <w:tcPr>
-            <w:tcW w:type="dxa" w:w="3600"/>
+            <w:tcW w:type="dxa" w:w="3312"/>
             <w:shd w:val="clear" w:fill="1F4E79"/>
           </w:tcPr>
           <w:p>
@@ -166,13 +166,30 @@
                 <w:color w:val="FFFFFF"/>
                 <w:sz w:val="18"/>
               </w:rPr>
-              <w:t>Key findings</w:t>
+              <w:t>What SynCura Used</w:t>
             </w:r>
           </w:p>
         </w:tc>
         <w:tc>
           <w:tcPr>
-            <w:tcW w:type="dxa" w:w="3600"/>
+            <w:tcW w:type="dxa" w:w="3384"/>
+            <w:shd w:val="clear" w:fill="1F4E79"/>
+          </w:tcPr>
+          <w:p>
+            <w:r/>
+            <w:r>
+              <w:rPr>
+                <w:b/>
+                <w:color w:val="FFFFFF"/>
+                <w:sz w:val="18"/>
+              </w:rPr>
+              <w:t>Key Findings</w:t>
+            </w:r>
+          </w:p>
+        </w:tc>
+        <w:tc>
+          <w:tcPr>
+            <w:tcW w:type="dxa" w:w="3312"/>
             <w:shd w:val="clear" w:fill="1F4E79"/>
           </w:tcPr>
           <w:p>
@@ -187,28 +204,11 @@
             </w:r>
           </w:p>
         </w:tc>
-        <w:tc>
-          <w:tcPr>
-            <w:tcW w:type="dxa" w:w="3600"/>
-            <w:shd w:val="clear" w:fill="1F4E79"/>
-          </w:tcPr>
-          <w:p>
-            <w:r/>
-            <w:r>
-              <w:rPr>
-                <w:b/>
-                <w:color w:val="FFFFFF"/>
-                <w:sz w:val="18"/>
-              </w:rPr>
-              <w:t>What SynCura used / adopted</w:t>
-            </w:r>
-          </w:p>
-        </w:tc>
       </w:tr>
       <w:tr>
         <w:tc>
           <w:tcPr>
-            <w:tcW w:type="dxa" w:w="792"/>
+            <w:tcW w:type="dxa" w:w="720"/>
           </w:tcPr>
           <w:p>
             <w:r/>
@@ -222,7 +222,7 @@
         </w:tc>
         <w:tc>
           <w:tcPr>
-            <w:tcW w:type="dxa" w:w="3024"/>
+            <w:tcW w:type="dxa" w:w="3384"/>
           </w:tcPr>
           <w:p>
             <w:r/>
@@ -230,13 +230,13 @@
               <w:rPr>
                 <w:sz w:val="18"/>
               </w:rPr>
-              <w:t>Zheng et al. (2025), JMIR 27:e69293. TBAL, 176,344 stays (MIMIC-IV + eICU).</w:t>
+              <w:t>Zheng, Luo, Zhu, Du, Lan, Zhou, Yang &amp; Huang (2025) - "Development and Validation of a Dynamic Real-Time Risk Prediction Model for ICU Patients Based on Longitudinal Irregular Data" (JMIR 27:e69293)</w:t>
             </w:r>
           </w:p>
         </w:tc>
         <w:tc>
           <w:tcPr>
-            <w:tcW w:type="dxa" w:w="3600"/>
+            <w:tcW w:type="dxa" w:w="3312"/>
           </w:tcPr>
           <w:p>
             <w:r/>
@@ -244,13 +244,13 @@
               <w:rPr>
                 <w:sz w:val="18"/>
               </w:rPr>
-              <w:t>Dynamic AUROC 0.936 (MIMIC-IV), 0.919 external eICU, recall 79.1%; hourly risk; time-aware attention.</w:t>
+              <w:t>Main architecture and task template. Adapted TBAL idea as 2-layer LSTM-96 + additive temporal attention; 90-min past-only windows; attention for temporal explanation; SHAP added.</w:t>
             </w:r>
           </w:p>
         </w:tc>
         <w:tc>
           <w:tcPr>
-            <w:tcW w:type="dxa" w:w="3600"/>
+            <w:tcW w:type="dxa" w:w="3384"/>
           </w:tcPr>
           <w:p>
             <w:r/>
@@ -258,13 +258,37 @@
               <w:rPr>
                 <w:sz w:val="18"/>
               </w:rPr>
-              <w:t>Retrospective till discharge (0.989 at discharge = hindsight bias); cross-hospital ~0.81/0.76; no bedside trial; richer EMR than streaming allows.</w:t>
+              <w:t>- Gives hourly ICU risk scores that update as new data arrives</w:t>
+            </w:r>
+          </w:p>
+          <w:p>
+            <w:r>
+              <w:rPr>
+                <w:sz w:val="18"/>
+              </w:rPr>
+              <w:t>- Scored 0.936 on home-hospital data and 0.919 on outside hospitals</w:t>
+            </w:r>
+          </w:p>
+          <w:p>
+            <w:r>
+              <w:rPr>
+                <w:sz w:val="18"/>
+              </w:rPr>
+              <w:t>- Correctly flagged about 8 in 10 high-risk patients (recall 79.1%)</w:t>
+            </w:r>
+          </w:p>
+          <w:p>
+            <w:r>
+              <w:rPr>
+                <w:sz w:val="18"/>
+              </w:rPr>
+              <w:t>- Shows which past hours mattered most for each prediction</w:t>
             </w:r>
           </w:p>
         </w:tc>
         <w:tc>
           <w:tcPr>
-            <w:tcW w:type="dxa" w:w="3600"/>
+            <w:tcW w:type="dxa" w:w="3312"/>
           </w:tcPr>
           <w:p>
             <w:r/>
@@ -272,7 +296,31 @@
               <w:rPr>
                 <w:sz w:val="18"/>
               </w:rPr>
-              <w:t>Main template: 2-layer LSTM-96 + temporal attention; 90-min past-only windows; attention for temporal explanation; SHAP added.</w:t>
+              <w:t>- Tested on old records, not live bedside use</w:t>
+            </w:r>
+          </w:p>
+          <w:p>
+            <w:r>
+              <w:rPr>
+                <w:sz w:val="18"/>
+              </w:rPr>
+              <w:t>- Looks best near discharge, when the outcome is already clear</w:t>
+            </w:r>
+          </w:p>
+          <w:p>
+            <w:r>
+              <w:rPr>
+                <w:sz w:val="18"/>
+              </w:rPr>
+              <w:t>- Accuracy falls on other hospitals (about 0.81/0.76)</w:t>
+            </w:r>
+          </w:p>
+          <w:p>
+            <w:r>
+              <w:rPr>
+                <w:sz w:val="18"/>
+              </w:rPr>
+              <w:t>- Uses richer records than a bedside monitor would have</w:t>
             </w:r>
           </w:p>
         </w:tc>
@@ -280,7 +328,7 @@
       <w:tr>
         <w:tc>
           <w:tcPr>
-            <w:tcW w:type="dxa" w:w="792"/>
+            <w:tcW w:type="dxa" w:w="720"/>
           </w:tcPr>
           <w:p>
             <w:r/>
@@ -294,7 +342,7 @@
         </w:tc>
         <w:tc>
           <w:tcPr>
-            <w:tcW w:type="dxa" w:w="3024"/>
+            <w:tcW w:type="dxa" w:w="3384"/>
           </w:tcPr>
           <w:p>
             <w:r/>
@@ -302,13 +350,13 @@
               <w:rPr>
                 <w:sz w:val="18"/>
               </w:rPr>
-              <w:t>Wang, Bai &amp; Jin (2026), Front. Physiol. 17. Explainable ICU models.</w:t>
+              <w:t>Wang, Bai &amp; Jin (2026) - "Explainable Deep-Learning Models for Predicting ICU Patient Outcome" (Frontiers in Physiology 17)</w:t>
             </w:r>
           </w:p>
         </w:tc>
         <w:tc>
           <w:tcPr>
-            <w:tcW w:type="dxa" w:w="3600"/>
+            <w:tcW w:type="dxa" w:w="3312"/>
           </w:tcPr>
           <w:p>
             <w:r/>
@@ -316,13 +364,13 @@
               <w:rPr>
                 <w:sz w:val="18"/>
               </w:rPr>
-              <w:t>Explainable LSTM, AUC ~0.79-0.87; feature explanations aid review.</w:t>
+              <w:t>Explainability justification. Temporal attention (when) + SHAP (which features) via dashboard and /patient/{id}/explain.</w:t>
             </w:r>
           </w:p>
         </w:tc>
         <w:tc>
           <w:tcPr>
-            <w:tcW w:type="dxa" w:w="3600"/>
+            <w:tcW w:type="dxa" w:w="3384"/>
           </w:tcPr>
           <w:p>
             <w:r/>
@@ -330,13 +378,29 @@
               <w:rPr>
                 <w:sz w:val="18"/>
               </w:rPr>
-              <w:t>Single-dataset; descriptive not causal; thin false-alarm/lead-time/calibration reporting.</w:t>
+              <w:t>- Explains predictions with per-feature reasons</w:t>
+            </w:r>
+          </w:p>
+          <w:p>
+            <w:r>
+              <w:rPr>
+                <w:sz w:val="18"/>
+              </w:rPr>
+              <w:t>- Scored AUC 0.79-0.87 on ICU outcomes</w:t>
+            </w:r>
+          </w:p>
+          <w:p>
+            <w:r>
+              <w:rPr>
+                <w:sz w:val="18"/>
+              </w:rPr>
+              <w:t>- Built for clinician review, not just a single number</w:t>
             </w:r>
           </w:p>
         </w:tc>
         <w:tc>
           <w:tcPr>
-            <w:tcW w:type="dxa" w:w="3600"/>
+            <w:tcW w:type="dxa" w:w="3312"/>
           </w:tcPr>
           <w:p>
             <w:r/>
@@ -344,7 +408,23 @@
               <w:rPr>
                 <w:sz w:val="18"/>
               </w:rPr>
-              <w:t>Attention (when) + SHAP (which features) via dashboard and /patient/{id}/explain.</w:t>
+              <w:t>- Tested on one dataset only</w:t>
+            </w:r>
+          </w:p>
+          <w:p>
+            <w:r>
+              <w:rPr>
+                <w:sz w:val="18"/>
+              </w:rPr>
+              <w:t>- Explanations describe the model, not proven causes</w:t>
+            </w:r>
+          </w:p>
+          <w:p>
+            <w:r>
+              <w:rPr>
+                <w:sz w:val="18"/>
+              </w:rPr>
+              <w:t>- Little data on false alarms or bedside use</w:t>
             </w:r>
           </w:p>
         </w:tc>
@@ -352,7 +432,7 @@
       <w:tr>
         <w:tc>
           <w:tcPr>
-            <w:tcW w:type="dxa" w:w="792"/>
+            <w:tcW w:type="dxa" w:w="720"/>
           </w:tcPr>
           <w:p>
             <w:r/>
@@ -366,7 +446,7 @@
         </w:tc>
         <w:tc>
           <w:tcPr>
-            <w:tcW w:type="dxa" w:w="3024"/>
+            <w:tcW w:type="dxa" w:w="3384"/>
           </w:tcPr>
           <w:p>
             <w:r/>
@@ -374,13 +454,13 @@
               <w:rPr>
                 <w:sz w:val="18"/>
               </w:rPr>
-              <w:t>Yan et al. (2026), PeerJ 14:e21631. LSTM/GRU/RNN/Transformer/Informer.</w:t>
+              <w:t>Yan, Wang, Xu, Guo, Chang &amp; He (2026) - "Deep Learning-Based In-Hospital Mortality Prediction Using Long-Term Sequential Data in ICU Patients" (PeerJ 14:e21631)</w:t>
             </w:r>
           </w:p>
         </w:tc>
         <w:tc>
           <w:tcPr>
-            <w:tcW w:type="dxa" w:w="3600"/>
+            <w:tcW w:type="dxa" w:w="3312"/>
           </w:tcPr>
           <w:p>
             <w:r/>
@@ -388,13 +468,13 @@
               <w:rPr>
                 <w:sz w:val="18"/>
               </w:rPr>
-              <w:t>Plain LSTM best single, AUC 0.802 (95% CI 0.774-0.828); external below internal.</w:t>
+              <w:t>Realistic benchmark. Kept LSTM baseline; unseen-patient evaluation (fresh 20% set-B holdout).</w:t>
             </w:r>
           </w:p>
         </w:tc>
         <w:tc>
           <w:tcPr>
-            <w:tcW w:type="dxa" w:w="3600"/>
+            <w:tcW w:type="dxa" w:w="3384"/>
           </w:tcPr>
           <w:p>
             <w:r/>
@@ -402,13 +482,29 @@
               <w:rPr>
                 <w:sz w:val="18"/>
               </w:rPr>
-              <w:t>Modest AUC; stacking adds complexity; retrospective, no deployment analysis.</w:t>
+              <w:t>- Compared 5 model types; plain LSTM won with AUC 0.802</w:t>
+            </w:r>
+          </w:p>
+          <w:p>
+            <w:r>
+              <w:rPr>
+                <w:sz w:val="18"/>
+              </w:rPr>
+              <w:t>- Newer Transformer models did not beat it</w:t>
+            </w:r>
+          </w:p>
+          <w:p>
+            <w:r>
+              <w:rPr>
+                <w:sz w:val="18"/>
+              </w:rPr>
+              <w:t>- Scores dropped on outside hospitals' data</w:t>
             </w:r>
           </w:p>
         </w:tc>
         <w:tc>
           <w:tcPr>
-            <w:tcW w:type="dxa" w:w="3600"/>
+            <w:tcW w:type="dxa" w:w="3312"/>
           </w:tcPr>
           <w:p>
             <w:r/>
@@ -416,7 +512,23 @@
               <w:rPr>
                 <w:sz w:val="18"/>
               </w:rPr>
-              <w:t>Kept LSTM baseline; unseen-patient evaluation (fresh 20% set-B holdout).</w:t>
+              <w:t>- Overall accuracy is modest</w:t>
+            </w:r>
+          </w:p>
+          <w:p>
+            <w:r>
+              <w:rPr>
+                <w:sz w:val="18"/>
+              </w:rPr>
+              <w:t>- Fancier combined models add complexity for small gains</w:t>
+            </w:r>
+          </w:p>
+          <w:p>
+            <w:r>
+              <w:rPr>
+                <w:sz w:val="18"/>
+              </w:rPr>
+              <w:t>- No live deployment or alarm testing</w:t>
             </w:r>
           </w:p>
         </w:tc>
@@ -424,7 +536,7 @@
       <w:tr>
         <w:tc>
           <w:tcPr>
-            <w:tcW w:type="dxa" w:w="792"/>
+            <w:tcW w:type="dxa" w:w="720"/>
           </w:tcPr>
           <w:p>
             <w:r/>
@@ -438,7 +550,7 @@
         </w:tc>
         <w:tc>
           <w:tcPr>
-            <w:tcW w:type="dxa" w:w="3024"/>
+            <w:tcW w:type="dxa" w:w="3384"/>
           </w:tcPr>
           <w:p>
             <w:r/>
@@ -446,13 +558,13 @@
               <w:rPr>
                 <w:sz w:val="18"/>
               </w:rPr>
-              <w:t>Sadanandan (2026), arXiv:2603.14719. LSTM + ClinicalBERT, 74,822 stays.</w:t>
+              <w:t>Sadanandan (2026) - "Multimodal Deep Learning for Early Prediction of Patient Deterioration in the ICU: Integrating Time-Series EHR Data with Clinical Notes" (arXiv:2603.14719)</w:t>
             </w:r>
           </w:p>
         </w:tc>
         <w:tc>
           <w:tcPr>
-            <w:tcW w:type="dxa" w:w="3600"/>
+            <w:tcW w:type="dxa" w:w="3312"/>
           </w:tcPr>
           <w:p>
             <w:r/>
@@ -460,13 +572,13 @@
               <w:rPr>
                 <w:sz w:val="18"/>
               </w:rPr>
-              <w:t>AUROC 0.7857, AUPRC 0.1908; structured-only field range 0.70-0.85.</w:t>
+              <w:t>Scope control. Used 0.70-0.85 range to set realistic targets; note fusion deferred to future work.</w:t>
             </w:r>
           </w:p>
         </w:tc>
         <w:tc>
           <w:tcPr>
-            <w:tcW w:type="dxa" w:w="3600"/>
+            <w:tcW w:type="dxa" w:w="3384"/>
           </w:tcPr>
           <w:p>
             <w:r/>
@@ -474,13 +586,29 @@
               <w:rPr>
                 <w:sz w:val="18"/>
               </w:rPr>
-              <w:t>Multimodal cost/privacy/compute/latency; low AUPRC; no bedside deploy.</w:t>
+              <w:t>- Combined vital-sign trends with doctors' notes</w:t>
+            </w:r>
+          </w:p>
+          <w:p>
+            <w:r>
+              <w:rPr>
+                <w:sz w:val="18"/>
+              </w:rPr>
+              <w:t>- Scored AUROC 0.786</w:t>
+            </w:r>
+          </w:p>
+          <w:p>
+            <w:r>
+              <w:rPr>
+                <w:sz w:val="18"/>
+              </w:rPr>
+              <w:t>- Survey of 31 studies: vitals-only systems typically score 0.70-0.85</w:t>
             </w:r>
           </w:p>
         </w:tc>
         <w:tc>
           <w:tcPr>
-            <w:tcW w:type="dxa" w:w="3600"/>
+            <w:tcW w:type="dxa" w:w="3312"/>
           </w:tcPr>
           <w:p>
             <w:r/>
@@ -488,7 +616,23 @@
               <w:rPr>
                 <w:sz w:val="18"/>
               </w:rPr>
-              <w:t>Used range to avoid overclaiming; deferred notes fusion to future work.</w:t>
+              <w:t>- Notes add data, privacy, compute, and delay costs</w:t>
+            </w:r>
+          </w:p>
+          <w:p>
+            <w:r>
+              <w:rPr>
+                <w:sz w:val="18"/>
+              </w:rPr>
+              <w:t>- Very few alarms would be true emergencies</w:t>
+            </w:r>
+          </w:p>
+          <w:p>
+            <w:r>
+              <w:rPr>
+                <w:sz w:val="18"/>
+              </w:rPr>
+              <w:t>- Not tested live at the bedside</w:t>
             </w:r>
           </w:p>
         </w:tc>
@@ -496,7 +640,7 @@
       <w:tr>
         <w:tc>
           <w:tcPr>
-            <w:tcW w:type="dxa" w:w="792"/>
+            <w:tcW w:type="dxa" w:w="720"/>
           </w:tcPr>
           <w:p>
             <w:r/>
@@ -510,7 +654,7 @@
         </w:tc>
         <w:tc>
           <w:tcPr>
-            <w:tcW w:type="dxa" w:w="3024"/>
+            <w:tcW w:type="dxa" w:w="3384"/>
           </w:tcPr>
           <w:p>
             <w:r/>
@@ -518,13 +662,13 @@
               <w:rPr>
                 <w:sz w:val="18"/>
               </w:rPr>
-              <w:t>Wu et al. (2024), J. Big Data 11:40. Vital-sign LSTM + external 889.</w:t>
+              <w:t>Wu et al. (2024) - "Revisiting the Potential Value of Vital Signs in the Real-Time Prediction of Mortality Risk in ICU Patients" (J. Big Data 11:40)</w:t>
             </w:r>
           </w:p>
         </w:tc>
         <w:tc>
           <w:tcPr>
-            <w:tcW w:type="dxa" w:w="3600"/>
+            <w:tcW w:type="dxa" w:w="3312"/>
           </w:tcPr>
           <w:p>
             <w:r/>
@@ -532,13 +676,13 @@
               <w:rPr>
                 <w:sz w:val="18"/>
               </w:rPr>
-              <w:t>Vitals LSTM AUC 0.9263, above RF (~0.744); small vitals carry strong signal.</w:t>
+              <w:t>Upper-bound reference. Same core vitals kept, extended to 12 vitals+labs with attention, SHAP, serving.</w:t>
             </w:r>
           </w:p>
         </w:tc>
         <w:tc>
           <w:tcPr>
-            <w:tcW w:type="dxa" w:w="3600"/>
+            <w:tcW w:type="dxa" w:w="3384"/>
           </w:tcPr>
           <w:p>
             <w:r/>
@@ -546,13 +690,29 @@
               <w:rPr>
                 <w:sz w:val="18"/>
               </w:rPr>
-              <w:t>Different cohort/pipeline - ceiling, not head-to-head; limited explainability.</w:t>
+              <w:t>- Small vital-sign set alone predicted risk well (AUC 0.926)</w:t>
+            </w:r>
+          </w:p>
+          <w:p>
+            <w:r>
+              <w:rPr>
+                <w:sz w:val="18"/>
+              </w:rPr>
+              <w:t>- Beat standard statistical methods</w:t>
+            </w:r>
+          </w:p>
+          <w:p>
+            <w:r>
+              <w:rPr>
+                <w:sz w:val="18"/>
+              </w:rPr>
+              <w:t>- Also tested on a second independent hospital</w:t>
             </w:r>
           </w:p>
         </w:tc>
         <w:tc>
           <w:tcPr>
-            <w:tcW w:type="dxa" w:w="3600"/>
+            <w:tcW w:type="dxa" w:w="3312"/>
           </w:tcPr>
           <w:p>
             <w:r/>
@@ -560,7 +720,23 @@
               <w:rPr>
                 <w:sz w:val="18"/>
               </w:rPr>
-              <w:t>Same core vitals kept, extended to 12 vitals+labs with attention, SHAP, serving.</w:t>
+              <w:t>- Different patients and methods from ours, so not directly comparable</w:t>
+            </w:r>
+          </w:p>
+          <w:p>
+            <w:r>
+              <w:rPr>
+                <w:sz w:val="18"/>
+              </w:rPr>
+              <w:t>- Little explanation of individual predictions</w:t>
+            </w:r>
+          </w:p>
+          <w:p>
+            <w:r>
+              <w:rPr>
+                <w:sz w:val="18"/>
+              </w:rPr>
+              <w:t>- No deployment study</w:t>
             </w:r>
           </w:p>
         </w:tc>
@@ -568,7 +744,7 @@
       <w:tr>
         <w:tc>
           <w:tcPr>
-            <w:tcW w:type="dxa" w:w="792"/>
+            <w:tcW w:type="dxa" w:w="720"/>
           </w:tcPr>
           <w:p>
             <w:r/>
@@ -582,7 +758,7 @@
         </w:tc>
         <w:tc>
           <w:tcPr>
-            <w:tcW w:type="dxa" w:w="3024"/>
+            <w:tcW w:type="dxa" w:w="3384"/>
           </w:tcPr>
           <w:p>
             <w:r/>
@@ -590,13 +766,13 @@
               <w:rPr>
                 <w:sz w:val="18"/>
               </w:rPr>
-              <w:t>Xie et al. (2025), npj Digit. Med. 8:733. RealMIP recovery.</w:t>
+              <w:t>Xie et al. (2025) - "Unlocking the Potential of Real-Time ICU Mortality Prediction: Redefining Risk Assessment with Continuous Data Recovery" (npj Digital Medicine 8:733)</w:t>
             </w:r>
           </w:p>
         </w:tc>
         <w:tc>
           <w:tcPr>
-            <w:tcW w:type="dxa" w:w="3600"/>
+            <w:tcW w:type="dxa" w:w="3312"/>
           </w:tcPr>
           <w:p>
             <w:r/>
@@ -604,13 +780,13 @@
               <w:rPr>
                 <w:sz w:val="18"/>
               </w:rPr>
-              <w:t>AUC ~0.957-0.968 across eICU/MIMIC-IV/SICdb; real-time imputation helps.</w:t>
+              <w:t>Missing-data roadmap. Beyond interpolation + train-only z-score; add external validation.</w:t>
             </w:r>
           </w:p>
         </w:tc>
         <w:tc>
           <w:tcPr>
-            <w:tcW w:type="dxa" w:w="3600"/>
+            <w:tcW w:type="dxa" w:w="3384"/>
           </w:tcPr>
           <w:p>
             <w:r/>
@@ -618,13 +794,29 @@
               <w:rPr>
                 <w:sz w:val="18"/>
               </w:rPr>
-              <w:t>Needs multi-DB training; heavier than current prototype.</w:t>
+              <w:t>- Fills in missing measurements as they stream in</w:t>
+            </w:r>
+          </w:p>
+          <w:p>
+            <w:r>
+              <w:rPr>
+                <w:sz w:val="18"/>
+              </w:rPr>
+              <w:t>- Scored 0.957-0.968 across several hospital databases</w:t>
+            </w:r>
+          </w:p>
+          <w:p>
+            <w:r>
+              <w:rPr>
+                <w:sz w:val="18"/>
+              </w:rPr>
+              <w:t>- Worked across different hospital systems</w:t>
             </w:r>
           </w:p>
         </w:tc>
         <w:tc>
           <w:tcPr>
-            <w:tcW w:type="dxa" w:w="3600"/>
+            <w:tcW w:type="dxa" w:w="3312"/>
           </w:tcPr>
           <w:p>
             <w:r/>
@@ -632,7 +824,23 @@
               <w:rPr>
                 <w:sz w:val="18"/>
               </w:rPr>
-              <w:t>Roadmap beyond interpolation + train-only z-score; add external validation.</w:t>
+              <w:t>- Needs data from many hospitals to train</w:t>
+            </w:r>
+          </w:p>
+          <w:p>
+            <w:r>
+              <w:rPr>
+                <w:sz w:val="18"/>
+              </w:rPr>
+              <w:t>- Heavier model than our prototype can run now</w:t>
+            </w:r>
+          </w:p>
+          <w:p>
+            <w:r>
+              <w:rPr>
+                <w:sz w:val="18"/>
+              </w:rPr>
+              <w:t>- Not tested in our hospital setting</w:t>
             </w:r>
           </w:p>
         </w:tc>
@@ -640,7 +848,7 @@
       <w:tr>
         <w:tc>
           <w:tcPr>
-            <w:tcW w:type="dxa" w:w="792"/>
+            <w:tcW w:type="dxa" w:w="720"/>
           </w:tcPr>
           <w:p>
             <w:r/>
@@ -654,7 +862,7 @@
         </w:tc>
         <w:tc>
           <w:tcPr>
-            <w:tcW w:type="dxa" w:w="3024"/>
+            <w:tcW w:type="dxa" w:w="3384"/>
           </w:tcPr>
           <w:p>
             <w:r/>
@@ -662,41 +870,13 @@
               <w:rPr>
                 <w:sz w:val="18"/>
               </w:rPr>
-              <w:t>Choi et al. (2020), IEEE J-BHI 24(9). Interpretable BiLSTM warning.</w:t>
+              <w:t>Choi et al. (2020) - "Deep Interpretable Early Warning System for the Detection of Clinical Deterioration" (IEEE J-BHI 24(9))</w:t>
             </w:r>
           </w:p>
         </w:tc>
         <w:tc>
           <w:tcPr>
-            <w:tcW w:type="dxa" w:w="3600"/>
-          </w:tcPr>
-          <w:p>
-            <w:r/>
-            <w:r>
-              <w:rPr>
-                <w:sz w:val="18"/>
-              </w:rPr>
-              <w:t>AUROC ~0.880, beating NEWS2-style baseline; sequential over static.</w:t>
-            </w:r>
-          </w:p>
-        </w:tc>
-        <w:tc>
-          <w:tcPr>
-            <w:tcW w:type="dxa" w:w="3600"/>
-          </w:tcPr>
-          <w:p>
-            <w:r/>
-            <w:r>
-              <w:rPr>
-                <w:sz w:val="18"/>
-              </w:rPr>
-              <w:t>Retrospective; associative attention; thin calibration/false-alarm analysis.</w:t>
-            </w:r>
-          </w:p>
-        </w:tc>
-        <w:tc>
-          <w:tcPr>
-            <w:tcW w:type="dxa" w:w="3600"/>
+            <w:tcW w:type="dxa" w:w="3312"/>
           </w:tcPr>
           <w:p>
             <w:r/>
@@ -708,11 +888,71 @@
             </w:r>
           </w:p>
         </w:tc>
+        <w:tc>
+          <w:tcPr>
+            <w:tcW w:type="dxa" w:w="3384"/>
+          </w:tcPr>
+          <w:p>
+            <w:r/>
+            <w:r>
+              <w:rPr>
+                <w:sz w:val="18"/>
+              </w:rPr>
+              <w:t>- Gives early warnings that beat the NEWS2 score</w:t>
+            </w:r>
+          </w:p>
+          <w:p>
+            <w:r>
+              <w:rPr>
+                <w:sz w:val="18"/>
+              </w:rPr>
+              <w:t>- Scored AUROC about 0.880</w:t>
+            </w:r>
+          </w:p>
+          <w:p>
+            <w:r>
+              <w:rPr>
+                <w:sz w:val="18"/>
+              </w:rPr>
+              <w:t>- Shows reasons behind each warning</w:t>
+            </w:r>
+          </w:p>
+        </w:tc>
+        <w:tc>
+          <w:tcPr>
+            <w:tcW w:type="dxa" w:w="3312"/>
+          </w:tcPr>
+          <w:p>
+            <w:r/>
+            <w:r>
+              <w:rPr>
+                <w:sz w:val="18"/>
+              </w:rPr>
+              <w:t>- Tested on old hospital records</w:t>
+            </w:r>
+          </w:p>
+          <w:p>
+            <w:r>
+              <w:rPr>
+                <w:sz w:val="18"/>
+              </w:rPr>
+              <w:t>- Highlighted signals may not be true causes</w:t>
+            </w:r>
+          </w:p>
+          <w:p>
+            <w:r>
+              <w:rPr>
+                <w:sz w:val="18"/>
+              </w:rPr>
+              <w:t>- Little analysis of false alarms or daily workflow fit</w:t>
+            </w:r>
+          </w:p>
+        </w:tc>
       </w:tr>
       <w:tr>
         <w:tc>
           <w:tcPr>
-            <w:tcW w:type="dxa" w:w="792"/>
+            <w:tcW w:type="dxa" w:w="720"/>
           </w:tcPr>
           <w:p>
             <w:r/>
@@ -726,7 +966,7 @@
         </w:tc>
         <w:tc>
           <w:tcPr>
-            <w:tcW w:type="dxa" w:w="3024"/>
+            <w:tcW w:type="dxa" w:w="3384"/>
           </w:tcPr>
           <w:p>
             <w:r/>
@@ -734,13 +974,13 @@
               <w:rPr>
                 <w:sz w:val="18"/>
               </w:rPr>
-              <w:t>Scheid et al. (2025), Nat. Commun. 16:9513. Wearable continuous.</w:t>
+              <w:t>Scheid et al. (2025) - "Development and Validation of a Clinical Wearable Deep Learning Based Continuous In-Hospital Deterioration Prediction Model" (Nature Communications 16:9513)</w:t>
             </w:r>
           </w:p>
         </w:tc>
         <w:tc>
           <w:tcPr>
-            <w:tcW w:type="dxa" w:w="3600"/>
+            <w:tcW w:type="dxa" w:w="3312"/>
           </w:tcPr>
           <w:p>
             <w:r/>
@@ -748,13 +988,13 @@
               <w:rPr>
                 <w:sz w:val="18"/>
               </w:rPr>
-              <w:t>Wearables ~0.89 AUROC with long lead time in-setting.</w:t>
+              <w:t>SENSE-&gt;INGEST-&gt;SCORE-&gt;ACT architecture with HTTP/MQTT; prototype-only disclaimer.</w:t>
             </w:r>
           </w:p>
         </w:tc>
         <w:tc>
           <w:tcPr>
-            <w:tcW w:type="dxa" w:w="3600"/>
+            <w:tcW w:type="dxa" w:w="3384"/>
           </w:tcPr>
           <w:p>
             <w:r/>
@@ -762,13 +1002,29 @@
               <w:rPr>
                 <w:sz w:val="18"/>
               </w:rPr>
-              <w:t>Noise, dropouts, irregular sampling, integration gaps.</w:t>
+              <w:t>- Wearable sensors monitored patients continuously</w:t>
+            </w:r>
+          </w:p>
+          <w:p>
+            <w:r>
+              <w:rPr>
+                <w:sz w:val="18"/>
+              </w:rPr>
+              <w:t>- Scored AUROC about 0.89 with early advance warning</w:t>
+            </w:r>
+          </w:p>
+          <w:p>
+            <w:r>
+              <w:rPr>
+                <w:sz w:val="18"/>
+              </w:rPr>
+              <w:t>- Catches decline hours earlier in its setting</w:t>
             </w:r>
           </w:p>
         </w:tc>
         <w:tc>
           <w:tcPr>
-            <w:tcW w:type="dxa" w:w="3600"/>
+            <w:tcW w:type="dxa" w:w="3312"/>
           </w:tcPr>
           <w:p>
             <w:r/>
@@ -776,7 +1032,23 @@
               <w:rPr>
                 <w:sz w:val="18"/>
               </w:rPr>
-              <w:t>SENSE-&gt;INGEST-&gt;SCORE-&gt;ACT (ESP32+MAX30105, FastAPI/SQLite, 0-100, dashboard/alerts, HTTP+MQTT); prototype-only disclaimer.</w:t>
+              <w:t>- Sensors are noisy and drop out</w:t>
+            </w:r>
+          </w:p>
+          <w:p>
+            <w:r>
+              <w:rPr>
+                <w:sz w:val="18"/>
+              </w:rPr>
+              <w:t>- Measurements arrive irregularly</w:t>
+            </w:r>
+          </w:p>
+          <w:p>
+            <w:r>
+              <w:rPr>
+                <w:sz w:val="18"/>
+              </w:rPr>
+              <w:t>- Hospital device setup and workflow issues unsolved</w:t>
             </w:r>
           </w:p>
         </w:tc>
@@ -784,7 +1056,7 @@
       <w:tr>
         <w:tc>
           <w:tcPr>
-            <w:tcW w:type="dxa" w:w="792"/>
+            <w:tcW w:type="dxa" w:w="720"/>
           </w:tcPr>
           <w:p>
             <w:r/>
@@ -798,7 +1070,7 @@
         </w:tc>
         <w:tc>
           <w:tcPr>
-            <w:tcW w:type="dxa" w:w="3024"/>
+            <w:tcW w:type="dxa" w:w="3384"/>
           </w:tcPr>
           <w:p>
             <w:r/>
@@ -806,13 +1078,13 @@
               <w:rPr>
                 <w:sz w:val="18"/>
               </w:rPr>
-              <w:t>PhysioNet Challenge 2012 (4,000 patients, 48 h, mortality labels).</w:t>
+              <w:t>PhysioNet - "Computing in Cardiology Challenge 2012" (physionet.org/content/challenge-2012)</w:t>
             </w:r>
           </w:p>
         </w:tc>
         <w:tc>
           <w:tcPr>
-            <w:tcW w:type="dxa" w:w="3600"/>
+            <w:tcW w:type="dxa" w:w="3312"/>
           </w:tcPr>
           <w:p>
             <w:r/>
@@ -820,13 +1092,13 @@
               <w:rPr>
                 <w:sz w:val="18"/>
               </w:rPr>
-              <w:t>Standard reproducible ICU mortality benchmark.</w:t>
+              <w:t>Training and evaluation dataset. 12 features, 90-min windows stride 15, val 0.840 + holdout 0.844.</w:t>
             </w:r>
           </w:p>
         </w:tc>
         <w:tc>
           <w:tcPr>
-            <w:tcW w:type="dxa" w:w="3600"/>
+            <w:tcW w:type="dxa" w:w="3384"/>
           </w:tcPr>
           <w:p>
             <w:r/>
@@ -834,13 +1106,29 @@
               <w:rPr>
                 <w:sz w:val="18"/>
               </w:rPr>
-              <w:t>US-only, 2012-era, retrospective, sparse, biased.</w:t>
+              <w:t>- 4,000 ICU patients with 48 hours of measurements each</w:t>
+            </w:r>
+          </w:p>
+          <w:p>
+            <w:r>
+              <w:rPr>
+                <w:sz w:val="18"/>
+              </w:rPr>
+              <w:t>- Standard public testbed for ICU mortality models</w:t>
+            </w:r>
+          </w:p>
+          <w:p>
+            <w:r>
+              <w:rPr>
+                <w:sz w:val="18"/>
+              </w:rPr>
+              <w:t>- Includes survival/death labels for every patient</w:t>
             </w:r>
           </w:p>
         </w:tc>
         <w:tc>
           <w:tcPr>
-            <w:tcW w:type="dxa" w:w="3600"/>
+            <w:tcW w:type="dxa" w:w="3312"/>
           </w:tcPr>
           <w:p>
             <w:r/>
@@ -848,7 +1136,23 @@
               <w:rPr>
                 <w:sz w:val="18"/>
               </w:rPr>
-              <w:t>All modelling: 12 features, 90-min windows stride 15, val 0.840 + holdout 0.844.</w:t>
+              <w:t>- US-only data from 2012 care patterns</w:t>
+            </w:r>
+          </w:p>
+          <w:p>
+            <w:r>
+              <w:rPr>
+                <w:sz w:val="18"/>
+              </w:rPr>
+              <w:t>- Many gaps and uneven measurements</w:t>
+            </w:r>
+          </w:p>
+          <w:p>
+            <w:r>
+              <w:rPr>
+                <w:sz w:val="18"/>
+              </w:rPr>
+              <w:t>- May not reflect our patients or modern devices</w:t>
             </w:r>
           </w:p>
         </w:tc>
@@ -930,7 +1234,7 @@
         <w:t xml:space="preserve">Adopted: </w:t>
       </w:r>
       <w:r>
-        <w:t xml:space="preserve">Adopted: attention-LSTM design as 2-layer LSTM-96 + additive attention; 90-minute past-only windows; SHAP added for feature explanation; unseen holdout evaluation. </w:t>
+        <w:t xml:space="preserve">Adopted: attention-LSTM design as 2-layer LSTM-96 + additive attention; 90-minute past-only windows; SHAP added; unseen holdout evaluation. </w:t>
       </w:r>
     </w:p>
     <w:p>
@@ -977,7 +1281,7 @@
         <w:t xml:space="preserve">Adopted: </w:t>
       </w:r>
       <w:r>
-        <w:t xml:space="preserve">Adopted: dual explanation (attention = when, SHAP = which features) served via dashboard and explain endpoint. </w:t>
+        <w:t xml:space="preserve">Adopted: dual explanation (attention = when, SHAP = which features) via dashboard and explain endpoint. </w:t>
       </w:r>
     </w:p>
     <w:p>

</xml_diff>

<commit_message>
sort review table chronologically (base first, dataset last); content untouched
</commit_message>
<xml_diff>
--- a/LITERATURE_REVIEW_DOCUMENT.docx
+++ b/LITERATURE_REVIEW_DOCUMENT.docx
@@ -216,7 +216,7 @@
               <w:rPr>
                 <w:sz w:val="18"/>
               </w:rPr>
-              <w:t>[1]</w:t>
+              <w:t>[1] Base</w:t>
             </w:r>
           </w:p>
         </w:tc>
@@ -350,7 +350,7 @@
               <w:rPr>
                 <w:sz w:val="18"/>
               </w:rPr>
-              <w:t>Wang, Bai &amp; Jin (2026) - "Explainable Deep-Learning Models for Predicting ICU Patient Outcome" (Frontiers in Physiology 17)</w:t>
+              <w:t>Choi et al. (2020) - "Deep Interpretable Early Warning System for the Detection of Clinical Deterioration" (IEEE J-BHI 24(9))</w:t>
             </w:r>
           </w:p>
         </w:tc>
@@ -364,7 +364,7 @@
               <w:rPr>
                 <w:sz w:val="18"/>
               </w:rPr>
-              <w:t>Explainability justification. Temporal attention (when) + SHAP (which features) via dashboard and /patient/{id}/explain.</w:t>
+              <w:t>NEWS2 benchmark with sensitivity, specificity, precision, false alarms, lead time.</w:t>
             </w:r>
           </w:p>
         </w:tc>
@@ -378,7 +378,7 @@
               <w:rPr>
                 <w:sz w:val="18"/>
               </w:rPr>
-              <w:t>- Explains predictions with per-feature reasons</w:t>
+              <w:t>- Gives early warnings that beat the NEWS2 score</w:t>
             </w:r>
           </w:p>
           <w:p>
@@ -386,7 +386,7 @@
               <w:rPr>
                 <w:sz w:val="18"/>
               </w:rPr>
-              <w:t>- Scored AUC 0.79-0.87 on ICU outcomes</w:t>
+              <w:t>- Scored AUROC about 0.880</w:t>
             </w:r>
           </w:p>
           <w:p>
@@ -394,7 +394,7 @@
               <w:rPr>
                 <w:sz w:val="18"/>
               </w:rPr>
-              <w:t>- Built for clinician review, not just a single number</w:t>
+              <w:t>- Shows reasons behind each warning</w:t>
             </w:r>
           </w:p>
         </w:tc>
@@ -408,7 +408,7 @@
               <w:rPr>
                 <w:sz w:val="18"/>
               </w:rPr>
-              <w:t>- Tested on one dataset only</w:t>
+              <w:t>- Tested on old hospital records</w:t>
             </w:r>
           </w:p>
           <w:p>
@@ -416,7 +416,7 @@
               <w:rPr>
                 <w:sz w:val="18"/>
               </w:rPr>
-              <w:t>- Explanations describe the model, not proven causes</w:t>
+              <w:t>- Highlighted signals may not be true causes</w:t>
             </w:r>
           </w:p>
           <w:p>
@@ -424,7 +424,7 @@
               <w:rPr>
                 <w:sz w:val="18"/>
               </w:rPr>
-              <w:t>- Little data on false alarms or bedside use</w:t>
+              <w:t>- Little analysis of false alarms or daily workflow fit</w:t>
             </w:r>
           </w:p>
         </w:tc>
@@ -454,7 +454,7 @@
               <w:rPr>
                 <w:sz w:val="18"/>
               </w:rPr>
-              <w:t>Yan, Wang, Xu, Guo, Chang &amp; He (2026) - "Deep Learning-Based In-Hospital Mortality Prediction Using Long-Term Sequential Data in ICU Patients" (PeerJ 14:e21631)</w:t>
+              <w:t>Wu et al. (2024) - "Revisiting the Potential Value of Vital Signs in the Real-Time Prediction of Mortality Risk in ICU Patients" (J. Big Data 11:40)</w:t>
             </w:r>
           </w:p>
         </w:tc>
@@ -468,7 +468,7 @@
               <w:rPr>
                 <w:sz w:val="18"/>
               </w:rPr>
-              <w:t>Realistic benchmark. Kept LSTM baseline; unseen-patient evaluation (fresh 20% set-B holdout).</w:t>
+              <w:t>Upper-bound reference. Same core vitals kept, extended to 12 vitals+labs with attention, SHAP, serving.</w:t>
             </w:r>
           </w:p>
         </w:tc>
@@ -482,7 +482,7 @@
               <w:rPr>
                 <w:sz w:val="18"/>
               </w:rPr>
-              <w:t>- Compared 5 model types; plain LSTM won with AUC 0.802</w:t>
+              <w:t>- Small vital-sign set alone predicted risk well (AUC 0.926)</w:t>
             </w:r>
           </w:p>
           <w:p>
@@ -490,7 +490,7 @@
               <w:rPr>
                 <w:sz w:val="18"/>
               </w:rPr>
-              <w:t>- Newer Transformer models did not beat it</w:t>
+              <w:t>- Beat standard statistical methods</w:t>
             </w:r>
           </w:p>
           <w:p>
@@ -498,7 +498,7 @@
               <w:rPr>
                 <w:sz w:val="18"/>
               </w:rPr>
-              <w:t>- Scores dropped on outside hospitals' data</w:t>
+              <w:t>- Also tested on a second independent hospital</w:t>
             </w:r>
           </w:p>
         </w:tc>
@@ -512,7 +512,7 @@
               <w:rPr>
                 <w:sz w:val="18"/>
               </w:rPr>
-              <w:t>- Overall accuracy is modest</w:t>
+              <w:t>- Different patients and methods from ours, so not directly comparable</w:t>
             </w:r>
           </w:p>
           <w:p>
@@ -520,7 +520,7 @@
               <w:rPr>
                 <w:sz w:val="18"/>
               </w:rPr>
-              <w:t>- Fancier combined models add complexity for small gains</w:t>
+              <w:t>- Little explanation of individual predictions</w:t>
             </w:r>
           </w:p>
           <w:p>
@@ -528,7 +528,7 @@
               <w:rPr>
                 <w:sz w:val="18"/>
               </w:rPr>
-              <w:t>- No live deployment or alarm testing</w:t>
+              <w:t>- No deployment study</w:t>
             </w:r>
           </w:p>
         </w:tc>
@@ -545,6 +545,214 @@
                 <w:sz w:val="18"/>
               </w:rPr>
               <w:t>[4]</w:t>
+            </w:r>
+          </w:p>
+        </w:tc>
+        <w:tc>
+          <w:tcPr>
+            <w:tcW w:type="dxa" w:w="3384"/>
+          </w:tcPr>
+          <w:p>
+            <w:r/>
+            <w:r>
+              <w:rPr>
+                <w:sz w:val="18"/>
+              </w:rPr>
+              <w:t>Scheid et al. (2025) - "Development and Validation of a Clinical Wearable Deep Learning Based Continuous In-Hospital Deterioration Prediction Model" (Nature Communications 16:9513)</w:t>
+            </w:r>
+          </w:p>
+        </w:tc>
+        <w:tc>
+          <w:tcPr>
+            <w:tcW w:type="dxa" w:w="3312"/>
+          </w:tcPr>
+          <w:p>
+            <w:r/>
+            <w:r>
+              <w:rPr>
+                <w:sz w:val="18"/>
+              </w:rPr>
+              <w:t>SENSE-&gt;INGEST-&gt;SCORE-&gt;ACT architecture with HTTP/MQTT; prototype-only disclaimer.</w:t>
+            </w:r>
+          </w:p>
+        </w:tc>
+        <w:tc>
+          <w:tcPr>
+            <w:tcW w:type="dxa" w:w="3384"/>
+          </w:tcPr>
+          <w:p>
+            <w:r/>
+            <w:r>
+              <w:rPr>
+                <w:sz w:val="18"/>
+              </w:rPr>
+              <w:t>- Wearable sensors monitored patients continuously</w:t>
+            </w:r>
+          </w:p>
+          <w:p>
+            <w:r>
+              <w:rPr>
+                <w:sz w:val="18"/>
+              </w:rPr>
+              <w:t>- Scored AUROC about 0.89 with early advance warning</w:t>
+            </w:r>
+          </w:p>
+          <w:p>
+            <w:r>
+              <w:rPr>
+                <w:sz w:val="18"/>
+              </w:rPr>
+              <w:t>- Catches decline hours earlier in its setting</w:t>
+            </w:r>
+          </w:p>
+        </w:tc>
+        <w:tc>
+          <w:tcPr>
+            <w:tcW w:type="dxa" w:w="3312"/>
+          </w:tcPr>
+          <w:p>
+            <w:r/>
+            <w:r>
+              <w:rPr>
+                <w:sz w:val="18"/>
+              </w:rPr>
+              <w:t>- Sensors are noisy and drop out</w:t>
+            </w:r>
+          </w:p>
+          <w:p>
+            <w:r>
+              <w:rPr>
+                <w:sz w:val="18"/>
+              </w:rPr>
+              <w:t>- Measurements arrive irregularly</w:t>
+            </w:r>
+          </w:p>
+          <w:p>
+            <w:r>
+              <w:rPr>
+                <w:sz w:val="18"/>
+              </w:rPr>
+              <w:t>- Hospital device setup and workflow issues unsolved</w:t>
+            </w:r>
+          </w:p>
+        </w:tc>
+      </w:tr>
+      <w:tr>
+        <w:tc>
+          <w:tcPr>
+            <w:tcW w:type="dxa" w:w="720"/>
+          </w:tcPr>
+          <w:p>
+            <w:r/>
+            <w:r>
+              <w:rPr>
+                <w:sz w:val="18"/>
+              </w:rPr>
+              <w:t>[5]</w:t>
+            </w:r>
+          </w:p>
+        </w:tc>
+        <w:tc>
+          <w:tcPr>
+            <w:tcW w:type="dxa" w:w="3384"/>
+          </w:tcPr>
+          <w:p>
+            <w:r/>
+            <w:r>
+              <w:rPr>
+                <w:sz w:val="18"/>
+              </w:rPr>
+              <w:t>Xie et al. (2025) - "Unlocking the Potential of Real-Time ICU Mortality Prediction: Redefining Risk Assessment with Continuous Data Recovery" (npj Digital Medicine 8:733)</w:t>
+            </w:r>
+          </w:p>
+        </w:tc>
+        <w:tc>
+          <w:tcPr>
+            <w:tcW w:type="dxa" w:w="3312"/>
+          </w:tcPr>
+          <w:p>
+            <w:r/>
+            <w:r>
+              <w:rPr>
+                <w:sz w:val="18"/>
+              </w:rPr>
+              <w:t>Missing-data roadmap. Beyond interpolation + train-only z-score; add external validation.</w:t>
+            </w:r>
+          </w:p>
+        </w:tc>
+        <w:tc>
+          <w:tcPr>
+            <w:tcW w:type="dxa" w:w="3384"/>
+          </w:tcPr>
+          <w:p>
+            <w:r/>
+            <w:r>
+              <w:rPr>
+                <w:sz w:val="18"/>
+              </w:rPr>
+              <w:t>- Fills in missing measurements as they stream in</w:t>
+            </w:r>
+          </w:p>
+          <w:p>
+            <w:r>
+              <w:rPr>
+                <w:sz w:val="18"/>
+              </w:rPr>
+              <w:t>- Scored 0.957-0.968 across several hospital databases</w:t>
+            </w:r>
+          </w:p>
+          <w:p>
+            <w:r>
+              <w:rPr>
+                <w:sz w:val="18"/>
+              </w:rPr>
+              <w:t>- Worked across different hospital systems</w:t>
+            </w:r>
+          </w:p>
+        </w:tc>
+        <w:tc>
+          <w:tcPr>
+            <w:tcW w:type="dxa" w:w="3312"/>
+          </w:tcPr>
+          <w:p>
+            <w:r/>
+            <w:r>
+              <w:rPr>
+                <w:sz w:val="18"/>
+              </w:rPr>
+              <w:t>- Needs data from many hospitals to train</w:t>
+            </w:r>
+          </w:p>
+          <w:p>
+            <w:r>
+              <w:rPr>
+                <w:sz w:val="18"/>
+              </w:rPr>
+              <w:t>- Heavier model than our prototype can run now</w:t>
+            </w:r>
+          </w:p>
+          <w:p>
+            <w:r>
+              <w:rPr>
+                <w:sz w:val="18"/>
+              </w:rPr>
+              <w:t>- Not tested in our hospital setting</w:t>
+            </w:r>
+          </w:p>
+        </w:tc>
+      </w:tr>
+      <w:tr>
+        <w:tc>
+          <w:tcPr>
+            <w:tcW w:type="dxa" w:w="720"/>
+          </w:tcPr>
+          <w:p>
+            <w:r/>
+            <w:r>
+              <w:rPr>
+                <w:sz w:val="18"/>
+              </w:rPr>
+              <w:t>[6]</w:t>
             </w:r>
           </w:p>
         </w:tc>
@@ -648,214 +856,6 @@
               <w:rPr>
                 <w:sz w:val="18"/>
               </w:rPr>
-              <w:t>[5]</w:t>
-            </w:r>
-          </w:p>
-        </w:tc>
-        <w:tc>
-          <w:tcPr>
-            <w:tcW w:type="dxa" w:w="3384"/>
-          </w:tcPr>
-          <w:p>
-            <w:r/>
-            <w:r>
-              <w:rPr>
-                <w:sz w:val="18"/>
-              </w:rPr>
-              <w:t>Wu et al. (2024) - "Revisiting the Potential Value of Vital Signs in the Real-Time Prediction of Mortality Risk in ICU Patients" (J. Big Data 11:40)</w:t>
-            </w:r>
-          </w:p>
-        </w:tc>
-        <w:tc>
-          <w:tcPr>
-            <w:tcW w:type="dxa" w:w="3312"/>
-          </w:tcPr>
-          <w:p>
-            <w:r/>
-            <w:r>
-              <w:rPr>
-                <w:sz w:val="18"/>
-              </w:rPr>
-              <w:t>Upper-bound reference. Same core vitals kept, extended to 12 vitals+labs with attention, SHAP, serving.</w:t>
-            </w:r>
-          </w:p>
-        </w:tc>
-        <w:tc>
-          <w:tcPr>
-            <w:tcW w:type="dxa" w:w="3384"/>
-          </w:tcPr>
-          <w:p>
-            <w:r/>
-            <w:r>
-              <w:rPr>
-                <w:sz w:val="18"/>
-              </w:rPr>
-              <w:t>- Small vital-sign set alone predicted risk well (AUC 0.926)</w:t>
-            </w:r>
-          </w:p>
-          <w:p>
-            <w:r>
-              <w:rPr>
-                <w:sz w:val="18"/>
-              </w:rPr>
-              <w:t>- Beat standard statistical methods</w:t>
-            </w:r>
-          </w:p>
-          <w:p>
-            <w:r>
-              <w:rPr>
-                <w:sz w:val="18"/>
-              </w:rPr>
-              <w:t>- Also tested on a second independent hospital</w:t>
-            </w:r>
-          </w:p>
-        </w:tc>
-        <w:tc>
-          <w:tcPr>
-            <w:tcW w:type="dxa" w:w="3312"/>
-          </w:tcPr>
-          <w:p>
-            <w:r/>
-            <w:r>
-              <w:rPr>
-                <w:sz w:val="18"/>
-              </w:rPr>
-              <w:t>- Different patients and methods from ours, so not directly comparable</w:t>
-            </w:r>
-          </w:p>
-          <w:p>
-            <w:r>
-              <w:rPr>
-                <w:sz w:val="18"/>
-              </w:rPr>
-              <w:t>- Little explanation of individual predictions</w:t>
-            </w:r>
-          </w:p>
-          <w:p>
-            <w:r>
-              <w:rPr>
-                <w:sz w:val="18"/>
-              </w:rPr>
-              <w:t>- No deployment study</w:t>
-            </w:r>
-          </w:p>
-        </w:tc>
-      </w:tr>
-      <w:tr>
-        <w:tc>
-          <w:tcPr>
-            <w:tcW w:type="dxa" w:w="720"/>
-          </w:tcPr>
-          <w:p>
-            <w:r/>
-            <w:r>
-              <w:rPr>
-                <w:sz w:val="18"/>
-              </w:rPr>
-              <w:t>[6]</w:t>
-            </w:r>
-          </w:p>
-        </w:tc>
-        <w:tc>
-          <w:tcPr>
-            <w:tcW w:type="dxa" w:w="3384"/>
-          </w:tcPr>
-          <w:p>
-            <w:r/>
-            <w:r>
-              <w:rPr>
-                <w:sz w:val="18"/>
-              </w:rPr>
-              <w:t>Xie et al. (2025) - "Unlocking the Potential of Real-Time ICU Mortality Prediction: Redefining Risk Assessment with Continuous Data Recovery" (npj Digital Medicine 8:733)</w:t>
-            </w:r>
-          </w:p>
-        </w:tc>
-        <w:tc>
-          <w:tcPr>
-            <w:tcW w:type="dxa" w:w="3312"/>
-          </w:tcPr>
-          <w:p>
-            <w:r/>
-            <w:r>
-              <w:rPr>
-                <w:sz w:val="18"/>
-              </w:rPr>
-              <w:t>Missing-data roadmap. Beyond interpolation + train-only z-score; add external validation.</w:t>
-            </w:r>
-          </w:p>
-        </w:tc>
-        <w:tc>
-          <w:tcPr>
-            <w:tcW w:type="dxa" w:w="3384"/>
-          </w:tcPr>
-          <w:p>
-            <w:r/>
-            <w:r>
-              <w:rPr>
-                <w:sz w:val="18"/>
-              </w:rPr>
-              <w:t>- Fills in missing measurements as they stream in</w:t>
-            </w:r>
-          </w:p>
-          <w:p>
-            <w:r>
-              <w:rPr>
-                <w:sz w:val="18"/>
-              </w:rPr>
-              <w:t>- Scored 0.957-0.968 across several hospital databases</w:t>
-            </w:r>
-          </w:p>
-          <w:p>
-            <w:r>
-              <w:rPr>
-                <w:sz w:val="18"/>
-              </w:rPr>
-              <w:t>- Worked across different hospital systems</w:t>
-            </w:r>
-          </w:p>
-        </w:tc>
-        <w:tc>
-          <w:tcPr>
-            <w:tcW w:type="dxa" w:w="3312"/>
-          </w:tcPr>
-          <w:p>
-            <w:r/>
-            <w:r>
-              <w:rPr>
-                <w:sz w:val="18"/>
-              </w:rPr>
-              <w:t>- Needs data from many hospitals to train</w:t>
-            </w:r>
-          </w:p>
-          <w:p>
-            <w:r>
-              <w:rPr>
-                <w:sz w:val="18"/>
-              </w:rPr>
-              <w:t>- Heavier model than our prototype can run now</w:t>
-            </w:r>
-          </w:p>
-          <w:p>
-            <w:r>
-              <w:rPr>
-                <w:sz w:val="18"/>
-              </w:rPr>
-              <w:t>- Not tested in our hospital setting</w:t>
-            </w:r>
-          </w:p>
-        </w:tc>
-      </w:tr>
-      <w:tr>
-        <w:tc>
-          <w:tcPr>
-            <w:tcW w:type="dxa" w:w="720"/>
-          </w:tcPr>
-          <w:p>
-            <w:r/>
-            <w:r>
-              <w:rPr>
-                <w:sz w:val="18"/>
-              </w:rPr>
               <w:t>[7]</w:t>
             </w:r>
           </w:p>
@@ -870,7 +870,7 @@
               <w:rPr>
                 <w:sz w:val="18"/>
               </w:rPr>
-              <w:t>Choi et al. (2020) - "Deep Interpretable Early Warning System for the Detection of Clinical Deterioration" (IEEE J-BHI 24(9))</w:t>
+              <w:t>Wang, Bai &amp; Jin (2026) - "Explainable Deep-Learning Models for Predicting ICU Patient Outcome" (Frontiers in Physiology 17)</w:t>
             </w:r>
           </w:p>
         </w:tc>
@@ -884,7 +884,7 @@
               <w:rPr>
                 <w:sz w:val="18"/>
               </w:rPr>
-              <w:t>NEWS2 benchmark with sensitivity, specificity, precision, false alarms, lead time.</w:t>
+              <w:t>Explainability justification. Temporal attention (when) + SHAP (which features) via dashboard and /patient/{id}/explain.</w:t>
             </w:r>
           </w:p>
         </w:tc>
@@ -898,7 +898,7 @@
               <w:rPr>
                 <w:sz w:val="18"/>
               </w:rPr>
-              <w:t>- Gives early warnings that beat the NEWS2 score</w:t>
+              <w:t>- Explains predictions with per-feature reasons</w:t>
             </w:r>
           </w:p>
           <w:p>
@@ -906,7 +906,7 @@
               <w:rPr>
                 <w:sz w:val="18"/>
               </w:rPr>
-              <w:t>- Scored AUROC about 0.880</w:t>
+              <w:t>- Scored AUC 0.79-0.87 on ICU outcomes</w:t>
             </w:r>
           </w:p>
           <w:p>
@@ -914,7 +914,7 @@
               <w:rPr>
                 <w:sz w:val="18"/>
               </w:rPr>
-              <w:t>- Shows reasons behind each warning</w:t>
+              <w:t>- Built for clinician review, not just a single number</w:t>
             </w:r>
           </w:p>
         </w:tc>
@@ -928,7 +928,7 @@
               <w:rPr>
                 <w:sz w:val="18"/>
               </w:rPr>
-              <w:t>- Tested on old hospital records</w:t>
+              <w:t>- Tested on one dataset only</w:t>
             </w:r>
           </w:p>
           <w:p>
@@ -936,7 +936,7 @@
               <w:rPr>
                 <w:sz w:val="18"/>
               </w:rPr>
-              <w:t>- Highlighted signals may not be true causes</w:t>
+              <w:t>- Explanations describe the model, not proven causes</w:t>
             </w:r>
           </w:p>
           <w:p>
@@ -944,7 +944,7 @@
               <w:rPr>
                 <w:sz w:val="18"/>
               </w:rPr>
-              <w:t>- Little analysis of false alarms or daily workflow fit</w:t>
+              <w:t>- Little data on false alarms or bedside use</w:t>
             </w:r>
           </w:p>
         </w:tc>
@@ -974,7 +974,7 @@
               <w:rPr>
                 <w:sz w:val="18"/>
               </w:rPr>
-              <w:t>Scheid et al. (2025) - "Development and Validation of a Clinical Wearable Deep Learning Based Continuous In-Hospital Deterioration Prediction Model" (Nature Communications 16:9513)</w:t>
+              <w:t>Yan, Wang, Xu, Guo, Chang &amp; He (2026) - "Deep Learning-Based In-Hospital Mortality Prediction Using Long-Term Sequential Data in ICU Patients" (PeerJ 14:e21631)</w:t>
             </w:r>
           </w:p>
         </w:tc>
@@ -988,7 +988,7 @@
               <w:rPr>
                 <w:sz w:val="18"/>
               </w:rPr>
-              <w:t>SENSE-&gt;INGEST-&gt;SCORE-&gt;ACT architecture with HTTP/MQTT; prototype-only disclaimer.</w:t>
+              <w:t>Realistic benchmark. Kept LSTM baseline; unseen-patient evaluation (fresh 20% set-B holdout).</w:t>
             </w:r>
           </w:p>
         </w:tc>
@@ -1002,7 +1002,7 @@
               <w:rPr>
                 <w:sz w:val="18"/>
               </w:rPr>
-              <w:t>- Wearable sensors monitored patients continuously</w:t>
+              <w:t>- Compared 5 model types; plain LSTM won with AUC 0.802</w:t>
             </w:r>
           </w:p>
           <w:p>
@@ -1010,7 +1010,7 @@
               <w:rPr>
                 <w:sz w:val="18"/>
               </w:rPr>
-              <w:t>- Scored AUROC about 0.89 with early advance warning</w:t>
+              <w:t>- Newer Transformer models did not beat it</w:t>
             </w:r>
           </w:p>
           <w:p>
@@ -1018,7 +1018,7 @@
               <w:rPr>
                 <w:sz w:val="18"/>
               </w:rPr>
-              <w:t>- Catches decline hours earlier in its setting</w:t>
+              <w:t>- Scores dropped on outside hospitals' data</w:t>
             </w:r>
           </w:p>
         </w:tc>
@@ -1032,7 +1032,7 @@
               <w:rPr>
                 <w:sz w:val="18"/>
               </w:rPr>
-              <w:t>- Sensors are noisy and drop out</w:t>
+              <w:t>- Overall accuracy is modest</w:t>
             </w:r>
           </w:p>
           <w:p>
@@ -1040,7 +1040,7 @@
               <w:rPr>
                 <w:sz w:val="18"/>
               </w:rPr>
-              <w:t>- Measurements arrive irregularly</w:t>
+              <w:t>- Fancier combined models add complexity for small gains</w:t>
             </w:r>
           </w:p>
           <w:p>
@@ -1048,7 +1048,7 @@
               <w:rPr>
                 <w:sz w:val="18"/>
               </w:rPr>
-              <w:t>- Hospital device setup and workflow issues unsolved</w:t>
+              <w:t>- No live deployment or alarm testing</w:t>
             </w:r>
           </w:p>
         </w:tc>
@@ -1245,7 +1245,242 @@
         <w:rPr>
           <w:b/>
         </w:rPr>
-        <w:t xml:space="preserve">[2] Wang, Bai &amp; Jin (2026) </w:t>
+        <w:t xml:space="preserve">[2] Choi et al. (2020) </w:t>
+      </w:r>
+      <w:r>
+        <w:rPr>
+          <w:b/>
+        </w:rPr>
+        <w:t xml:space="preserve">Approach: </w:t>
+      </w:r>
+      <w:r>
+        <w:t xml:space="preserve">Approach: BiLSTM + attention early-warning system benchmarked against NEWS2. </w:t>
+      </w:r>
+      <w:r>
+        <w:rPr>
+          <w:b/>
+        </w:rPr>
+        <w:t xml:space="preserve">Findings: </w:t>
+      </w:r>
+      <w:r>
+        <w:t xml:space="preserve">Findings: AUROC ~0.880, beating NEWS2-style baseline. </w:t>
+      </w:r>
+      <w:r>
+        <w:rPr>
+          <w:b/>
+        </w:rPr>
+        <w:t xml:space="preserve">Limitations: </w:t>
+      </w:r>
+      <w:r>
+        <w:t xml:space="preserve">Limitations: retrospective; associative attention; thin calibration/false-alarm analysis. </w:t>
+      </w:r>
+      <w:r>
+        <w:rPr>
+          <w:b/>
+        </w:rPr>
+        <w:t xml:space="preserve">Adopted: </w:t>
+      </w:r>
+      <w:r>
+        <w:t xml:space="preserve">Adopted: early-warning framing and NEWS2 comparison with sensitivity, specificity, precision, false alarms, lead time. </w:t>
+      </w:r>
+    </w:p>
+    <w:p>
+      <w:pPr>
+        <w:pStyle w:val="ListBullet"/>
+      </w:pPr>
+      <w:r>
+        <w:rPr>
+          <w:b/>
+        </w:rPr>
+        <w:t xml:space="preserve">[3] Wu et al. (2024) </w:t>
+      </w:r>
+      <w:r>
+        <w:rPr>
+          <w:b/>
+        </w:rPr>
+        <w:t xml:space="preserve">Approach: </w:t>
+      </w:r>
+      <w:r>
+        <w:t xml:space="preserve">Approach: short-window mortality from SBP/DBP/HR/RR/Temp (33,798 MIMIC-III + 889 external); LSTM vs RF/Cox. </w:t>
+      </w:r>
+      <w:r>
+        <w:rPr>
+          <w:b/>
+        </w:rPr>
+        <w:t xml:space="preserve">Findings: </w:t>
+      </w:r>
+      <w:r>
+        <w:t xml:space="preserve">Findings: vitals LSTM AUC 0.9263, far above classical baselines. </w:t>
+      </w:r>
+      <w:r>
+        <w:rPr>
+          <w:b/>
+        </w:rPr>
+        <w:t xml:space="preserve">Limitations: </w:t>
+      </w:r>
+      <w:r>
+        <w:t xml:space="preserve">Limitations: different cohort/pipeline - a ceiling, not a head-to-head target. </w:t>
+      </w:r>
+      <w:r>
+        <w:rPr>
+          <w:b/>
+        </w:rPr>
+        <w:t xml:space="preserve">Adopted: </w:t>
+      </w:r>
+      <w:r>
+        <w:t xml:space="preserve">Adopted: core vitals kept and extended to 12 vitals+labs with attention, SHAP, and serving path. </w:t>
+      </w:r>
+    </w:p>
+    <w:p>
+      <w:pPr>
+        <w:pStyle w:val="ListBullet"/>
+      </w:pPr>
+      <w:r>
+        <w:rPr>
+          <w:b/>
+        </w:rPr>
+        <w:t xml:space="preserve">[4] Scheid et al. (2025) </w:t>
+      </w:r>
+      <w:r>
+        <w:rPr>
+          <w:b/>
+        </w:rPr>
+        <w:t xml:space="preserve">Approach: </w:t>
+      </w:r>
+      <w:r>
+        <w:t xml:space="preserve">Approach: wearable deep learning for continuous in-hospital deterioration across hospitals. </w:t>
+      </w:r>
+      <w:r>
+        <w:rPr>
+          <w:b/>
+        </w:rPr>
+        <w:t xml:space="preserve">Findings: </w:t>
+      </w:r>
+      <w:r>
+        <w:t xml:space="preserve">Findings: ~0.89 AUROC with clinically useful lead time. </w:t>
+      </w:r>
+      <w:r>
+        <w:rPr>
+          <w:b/>
+        </w:rPr>
+        <w:t xml:space="preserve">Limitations: </w:t>
+      </w:r>
+      <w:r>
+        <w:t xml:space="preserve">Limitations: sensor noise, dropouts, irregular sampling, integration gaps. </w:t>
+      </w:r>
+      <w:r>
+        <w:rPr>
+          <w:b/>
+        </w:rPr>
+        <w:t xml:space="preserve">Adopted: </w:t>
+      </w:r>
+      <w:r>
+        <w:t xml:space="preserve">Adopted: SENSE-&gt;INGEST-&gt;SCORE-&gt;ACT architecture with HTTP/MQTT; prototype-only disclaimer retained. </w:t>
+      </w:r>
+    </w:p>
+    <w:p>
+      <w:pPr>
+        <w:pStyle w:val="ListBullet"/>
+      </w:pPr>
+      <w:r>
+        <w:rPr>
+          <w:b/>
+        </w:rPr>
+        <w:t xml:space="preserve">[5] Xie et al. (2025) - RealMIP </w:t>
+      </w:r>
+      <w:r>
+        <w:rPr>
+          <w:b/>
+        </w:rPr>
+        <w:t xml:space="preserve">Approach: </w:t>
+      </w:r>
+      <w:r>
+        <w:t xml:space="preserve">Approach: generative real-time imputation of missing vitals/labs plus mortality prediction; 188 eICU centres, MIMIC-IV/SICdb validation. </w:t>
+      </w:r>
+      <w:r>
+        <w:rPr>
+          <w:b/>
+        </w:rPr>
+        <w:t xml:space="preserve">Findings: </w:t>
+      </w:r>
+      <w:r>
+        <w:t xml:space="preserve">Findings: AUC ~0.957-0.968 with strong transfer. </w:t>
+      </w:r>
+      <w:r>
+        <w:rPr>
+          <w:b/>
+        </w:rPr>
+        <w:t xml:space="preserve">Limitations: </w:t>
+      </w:r>
+      <w:r>
+        <w:t xml:space="preserve">Limitations: needs multi-DB training; heavier than a student prototype. </w:t>
+      </w:r>
+      <w:r>
+        <w:rPr>
+          <w:b/>
+        </w:rPr>
+        <w:t xml:space="preserve">Adopted: </w:t>
+      </w:r>
+      <w:r>
+        <w:t xml:space="preserve">Adopted: roadmap item beyond interpolation + train-only z-score, paired with external validation. </w:t>
+      </w:r>
+    </w:p>
+    <w:p>
+      <w:pPr>
+        <w:pStyle w:val="ListBullet"/>
+      </w:pPr>
+      <w:r>
+        <w:rPr>
+          <w:b/>
+        </w:rPr>
+        <w:t xml:space="preserve">[6] Sadanandan (2026) </w:t>
+      </w:r>
+      <w:r>
+        <w:rPr>
+          <w:b/>
+        </w:rPr>
+        <w:t xml:space="preserve">Approach: </w:t>
+      </w:r>
+      <w:r>
+        <w:t xml:space="preserve">Approach: BiLSTM time-series + ClinicalBERT notes with cross-modal attention (74,822 stays); plus review of 31 studies. </w:t>
+      </w:r>
+      <w:r>
+        <w:rPr>
+          <w:b/>
+        </w:rPr>
+        <w:t xml:space="preserve">Findings: </w:t>
+      </w:r>
+      <w:r>
+        <w:t xml:space="preserve">Findings: AUROC 0.7857; structured-only field range 0.70-0.85. </w:t>
+      </w:r>
+      <w:r>
+        <w:rPr>
+          <w:b/>
+        </w:rPr>
+        <w:t xml:space="preserve">Limitations: </w:t>
+      </w:r>
+      <w:r>
+        <w:t xml:space="preserve">Limitations: multimodal cost/privacy/compute/latency; low AUPRC. </w:t>
+      </w:r>
+      <w:r>
+        <w:rPr>
+          <w:b/>
+        </w:rPr>
+        <w:t xml:space="preserve">Adopted: </w:t>
+      </w:r>
+      <w:r>
+        <w:t xml:space="preserve">Adopted: range used to set realistic targets; note fusion deferred to future work. </w:t>
+      </w:r>
+    </w:p>
+    <w:p>
+      <w:pPr>
+        <w:pStyle w:val="ListBullet"/>
+      </w:pPr>
+      <w:r>
+        <w:rPr>
+          <w:b/>
+        </w:rPr>
+        <w:t xml:space="preserve">[7] Wang, Bai &amp; Jin (2026) </w:t>
       </w:r>
       <w:r>
         <w:rPr>
@@ -1292,7 +1527,7 @@
         <w:rPr>
           <w:b/>
         </w:rPr>
-        <w:t xml:space="preserve">[3] Yan et al. (2026) </w:t>
+        <w:t xml:space="preserve">[8] Yan et al. (2026) </w:t>
       </w:r>
       <w:r>
         <w:rPr>
@@ -1329,241 +1564,6 @@
       </w:r>
       <w:r>
         <w:t xml:space="preserve">Adopted: simple 2-layer LSTM baseline; validation plus unseen set-B holdout reporting. </w:t>
-      </w:r>
-    </w:p>
-    <w:p>
-      <w:pPr>
-        <w:pStyle w:val="ListBullet"/>
-      </w:pPr>
-      <w:r>
-        <w:rPr>
-          <w:b/>
-        </w:rPr>
-        <w:t xml:space="preserve">[4] Sadanandan (2026) </w:t>
-      </w:r>
-      <w:r>
-        <w:rPr>
-          <w:b/>
-        </w:rPr>
-        <w:t xml:space="preserve">Approach: </w:t>
-      </w:r>
-      <w:r>
-        <w:t xml:space="preserve">Approach: BiLSTM time-series + ClinicalBERT notes with cross-modal attention (74,822 stays); plus review of 31 studies. </w:t>
-      </w:r>
-      <w:r>
-        <w:rPr>
-          <w:b/>
-        </w:rPr>
-        <w:t xml:space="preserve">Findings: </w:t>
-      </w:r>
-      <w:r>
-        <w:t xml:space="preserve">Findings: AUROC 0.7857; structured-only field range 0.70-0.85. </w:t>
-      </w:r>
-      <w:r>
-        <w:rPr>
-          <w:b/>
-        </w:rPr>
-        <w:t xml:space="preserve">Limitations: </w:t>
-      </w:r>
-      <w:r>
-        <w:t xml:space="preserve">Limitations: multimodal cost/privacy/compute/latency; low AUPRC. </w:t>
-      </w:r>
-      <w:r>
-        <w:rPr>
-          <w:b/>
-        </w:rPr>
-        <w:t xml:space="preserve">Adopted: </w:t>
-      </w:r>
-      <w:r>
-        <w:t xml:space="preserve">Adopted: range used to set realistic targets; note fusion deferred to future work. </w:t>
-      </w:r>
-    </w:p>
-    <w:p>
-      <w:pPr>
-        <w:pStyle w:val="ListBullet"/>
-      </w:pPr>
-      <w:r>
-        <w:rPr>
-          <w:b/>
-        </w:rPr>
-        <w:t xml:space="preserve">[5] Wu et al. (2024) </w:t>
-      </w:r>
-      <w:r>
-        <w:rPr>
-          <w:b/>
-        </w:rPr>
-        <w:t xml:space="preserve">Approach: </w:t>
-      </w:r>
-      <w:r>
-        <w:t xml:space="preserve">Approach: short-window mortality from SBP/DBP/HR/RR/Temp (33,798 MIMIC-III + 889 external); LSTM vs RF/Cox. </w:t>
-      </w:r>
-      <w:r>
-        <w:rPr>
-          <w:b/>
-        </w:rPr>
-        <w:t xml:space="preserve">Findings: </w:t>
-      </w:r>
-      <w:r>
-        <w:t xml:space="preserve">Findings: vitals LSTM AUC 0.9263, far above classical baselines. </w:t>
-      </w:r>
-      <w:r>
-        <w:rPr>
-          <w:b/>
-        </w:rPr>
-        <w:t xml:space="preserve">Limitations: </w:t>
-      </w:r>
-      <w:r>
-        <w:t xml:space="preserve">Limitations: different cohort/pipeline - a ceiling, not a head-to-head target. </w:t>
-      </w:r>
-      <w:r>
-        <w:rPr>
-          <w:b/>
-        </w:rPr>
-        <w:t xml:space="preserve">Adopted: </w:t>
-      </w:r>
-      <w:r>
-        <w:t xml:space="preserve">Adopted: core vitals kept and extended to 12 vitals+labs with attention, SHAP, and serving path. </w:t>
-      </w:r>
-    </w:p>
-    <w:p>
-      <w:pPr>
-        <w:pStyle w:val="ListBullet"/>
-      </w:pPr>
-      <w:r>
-        <w:rPr>
-          <w:b/>
-        </w:rPr>
-        <w:t xml:space="preserve">[6] Xie et al. (2025) - RealMIP </w:t>
-      </w:r>
-      <w:r>
-        <w:rPr>
-          <w:b/>
-        </w:rPr>
-        <w:t xml:space="preserve">Approach: </w:t>
-      </w:r>
-      <w:r>
-        <w:t xml:space="preserve">Approach: generative real-time imputation of missing vitals/labs plus mortality prediction; 188 eICU centres, MIMIC-IV/SICdb validation. </w:t>
-      </w:r>
-      <w:r>
-        <w:rPr>
-          <w:b/>
-        </w:rPr>
-        <w:t xml:space="preserve">Findings: </w:t>
-      </w:r>
-      <w:r>
-        <w:t xml:space="preserve">Findings: AUC ~0.957-0.968 with strong transfer. </w:t>
-      </w:r>
-      <w:r>
-        <w:rPr>
-          <w:b/>
-        </w:rPr>
-        <w:t xml:space="preserve">Limitations: </w:t>
-      </w:r>
-      <w:r>
-        <w:t xml:space="preserve">Limitations: needs multi-DB training; heavier than a student prototype. </w:t>
-      </w:r>
-      <w:r>
-        <w:rPr>
-          <w:b/>
-        </w:rPr>
-        <w:t xml:space="preserve">Adopted: </w:t>
-      </w:r>
-      <w:r>
-        <w:t xml:space="preserve">Adopted: roadmap item beyond interpolation + train-only z-score, paired with external validation. </w:t>
-      </w:r>
-    </w:p>
-    <w:p>
-      <w:pPr>
-        <w:pStyle w:val="ListBullet"/>
-      </w:pPr>
-      <w:r>
-        <w:rPr>
-          <w:b/>
-        </w:rPr>
-        <w:t xml:space="preserve">[7] Choi et al. (2020) </w:t>
-      </w:r>
-      <w:r>
-        <w:rPr>
-          <w:b/>
-        </w:rPr>
-        <w:t xml:space="preserve">Approach: </w:t>
-      </w:r>
-      <w:r>
-        <w:t xml:space="preserve">Approach: BiLSTM + attention early-warning system benchmarked against NEWS2. </w:t>
-      </w:r>
-      <w:r>
-        <w:rPr>
-          <w:b/>
-        </w:rPr>
-        <w:t xml:space="preserve">Findings: </w:t>
-      </w:r>
-      <w:r>
-        <w:t xml:space="preserve">Findings: AUROC ~0.880, beating NEWS2-style baseline. </w:t>
-      </w:r>
-      <w:r>
-        <w:rPr>
-          <w:b/>
-        </w:rPr>
-        <w:t xml:space="preserve">Limitations: </w:t>
-      </w:r>
-      <w:r>
-        <w:t xml:space="preserve">Limitations: retrospective; associative attention; thin calibration/false-alarm analysis. </w:t>
-      </w:r>
-      <w:r>
-        <w:rPr>
-          <w:b/>
-        </w:rPr>
-        <w:t xml:space="preserve">Adopted: </w:t>
-      </w:r>
-      <w:r>
-        <w:t xml:space="preserve">Adopted: early-warning framing and NEWS2 comparison with sensitivity, specificity, precision, false alarms, lead time. </w:t>
-      </w:r>
-    </w:p>
-    <w:p>
-      <w:pPr>
-        <w:pStyle w:val="ListBullet"/>
-      </w:pPr>
-      <w:r>
-        <w:rPr>
-          <w:b/>
-        </w:rPr>
-        <w:t xml:space="preserve">[8] Scheid et al. (2025) </w:t>
-      </w:r>
-      <w:r>
-        <w:rPr>
-          <w:b/>
-        </w:rPr>
-        <w:t xml:space="preserve">Approach: </w:t>
-      </w:r>
-      <w:r>
-        <w:t xml:space="preserve">Approach: wearable deep learning for continuous in-hospital deterioration across hospitals. </w:t>
-      </w:r>
-      <w:r>
-        <w:rPr>
-          <w:b/>
-        </w:rPr>
-        <w:t xml:space="preserve">Findings: </w:t>
-      </w:r>
-      <w:r>
-        <w:t xml:space="preserve">Findings: ~0.89 AUROC with clinically useful lead time. </w:t>
-      </w:r>
-      <w:r>
-        <w:rPr>
-          <w:b/>
-        </w:rPr>
-        <w:t xml:space="preserve">Limitations: </w:t>
-      </w:r>
-      <w:r>
-        <w:t xml:space="preserve">Limitations: sensor noise, dropouts, irregular sampling, integration gaps. </w:t>
-      </w:r>
-      <w:r>
-        <w:rPr>
-          <w:b/>
-        </w:rPr>
-        <w:t xml:space="preserve">Adopted: </w:t>
-      </w:r>
-      <w:r>
-        <w:t xml:space="preserve">Adopted: SENSE-&gt;INGEST-&gt;SCORE-&gt;ACT architecture with HTTP/MQTT; prototype-only disclaimer retained. </w:t>
       </w:r>
     </w:p>
     <w:p>
@@ -1655,6 +1655,46 @@
         <w:pStyle w:val="ListNumber"/>
       </w:pPr>
       <w:r>
+        <w:t>E. Choi et al., Deep Interpretable Early Warning System for Clinical Deterioration, IEEE J-BHI 24(9), 2020.</w:t>
+      </w:r>
+    </w:p>
+    <w:p>
+      <w:pPr>
+        <w:pStyle w:val="ListNumber"/>
+      </w:pPr>
+      <w:r>
+        <w:t>Y. Wu et al., Revisiting the Potential Value of Vital Signs in Mortality Risk Prediction, J. Big Data 11:40, 2024. https://doi.org/10.1186/s40537-024-00896-8</w:t>
+      </w:r>
+    </w:p>
+    <w:p>
+      <w:pPr>
+        <w:pStyle w:val="ListNumber"/>
+      </w:pPr>
+      <w:r>
+        <w:t>M. R. Scheid et al., Clinical Wearable Deep Learning Based Continuous Deterioration Prediction, Nature Communications 16:9513, 2025.</w:t>
+      </w:r>
+    </w:p>
+    <w:p>
+      <w:pPr>
+        <w:pStyle w:val="ListNumber"/>
+      </w:pPr>
+      <w:r>
+        <w:t>P. Xie et al., Unlocking Real-Time ICU Mortality Prediction, npj Digital Medicine 8:733, 2025. https://doi.org/10.1038/s41746-025-02114-y</w:t>
+      </w:r>
+    </w:p>
+    <w:p>
+      <w:pPr>
+        <w:pStyle w:val="ListNumber"/>
+      </w:pPr>
+      <w:r>
+        <w:t>B. Sadanandan, Multimodal Deep Learning for Early Prediction of Patient Deterioration in the ICU, arXiv:2603.14719, 2026. https://arxiv.org/abs/2603.14719</w:t>
+      </w:r>
+    </w:p>
+    <w:p>
+      <w:pPr>
+        <w:pStyle w:val="ListNumber"/>
+      </w:pPr>
+      <w:r>
         <w:t>Y. Wang, Y. Bai, and G. Jin, Explainable Deep-Learning Models for Predicting ICU Patient Outcome, Frontiers in Physiology 17, 2026.</w:t>
       </w:r>
     </w:p>
@@ -1671,52 +1711,12 @@
         <w:pStyle w:val="ListNumber"/>
       </w:pPr>
       <w:r>
-        <w:t>B. Sadanandan, Multimodal Deep Learning for Early Prediction of Patient Deterioration in the ICU, arXiv:2603.14719, 2026. https://arxiv.org/abs/2603.14719</w:t>
-      </w:r>
-    </w:p>
-    <w:p>
-      <w:pPr>
-        <w:pStyle w:val="ListNumber"/>
-      </w:pPr>
-      <w:r>
-        <w:t>Y. Wu et al., Revisiting the Potential Value of Vital Signs in Mortality Risk Prediction, J. Big Data 11:40, 2024. https://doi.org/10.1186/s40537-024-00896-8</w:t>
-      </w:r>
-    </w:p>
-    <w:p>
-      <w:pPr>
-        <w:pStyle w:val="ListNumber"/>
-      </w:pPr>
-      <w:r>
-        <w:t>P. Xie et al., Unlocking Real-Time ICU Mortality Prediction, npj Digital Medicine 8:733, 2025. https://doi.org/10.1038/s41746-025-02114-y</w:t>
-      </w:r>
-    </w:p>
-    <w:p>
-      <w:pPr>
-        <w:pStyle w:val="ListNumber"/>
-      </w:pPr>
-      <w:r>
-        <w:t>E. Choi et al., Deep Interpretable Early Warning System for Clinical Deterioration, IEEE J-BHI 24(9), 2020.</w:t>
-      </w:r>
-    </w:p>
-    <w:p>
-      <w:pPr>
-        <w:pStyle w:val="ListNumber"/>
-      </w:pPr>
-      <w:r>
-        <w:t>M. R. Scheid et al., Clinical Wearable Deep Learning Based Continuous Deterioration Prediction, Nature Communications 16:9513, 2025.</w:t>
-      </w:r>
-    </w:p>
-    <w:p>
-      <w:pPr>
-        <w:pStyle w:val="ListNumber"/>
-      </w:pPr>
-      <w:r>
         <w:t>PhysioNet, Computing in Cardiology Challenge 2012, https://physionet.org/content/challenge-2012/</w:t>
       </w:r>
     </w:p>
     <w:p>
       <w:r>
-        <w:t>Consistency check (2026-09-19): references match ppt/SynCura_Deck_V3_FINAL.pptx Slide 15; SynCura results match ppt/figs/metrics.json (val 0.840, holdout 0.844, CI 0.836-0.852).</w:t>
+        <w:t>Consistency check (2026-09-19): references match ppt/SynCura_Deck_V3_FINAL.pptx Slide 15; SynCura results match ppt/figs/metrics.json (val 0.840, holdout 0.844, CI 0.836-0.852); Table 1/notes/refs ordered chronologically with the base paper first and the dataset last (v1.3).</w:t>
       </w:r>
     </w:p>
     <w:sectPr>

</xml_diff>